<commit_message>
Impersonation attack added to demo Document updated with relevent screen shots
</commit_message>
<xml_diff>
--- a/COMP2006_Assessment2_Report2.docx
+++ b/COMP2006_Assessment2_Report2.docx
@@ -9,8 +9,8 @@
         <w:rPr>
           <w:rFonts w:ascii="Palatino Linotype" w:hAnsi="Palatino Linotype"/>
           <w:color w:val="000000" w:themeColor="text1"/>
-          <w:sz w:val="24"/>
-          <w:szCs w:val="24"/>
+          <w:sz w:val="32"/>
+          <w:szCs w:val="32"/>
         </w:rPr>
       </w:pPr>
       <w:r>
@@ -19,8 +19,8 @@
           <w:b/>
           <w:bCs/>
           <w:color w:val="000000" w:themeColor="text1"/>
-          <w:sz w:val="24"/>
-          <w:szCs w:val="24"/>
+          <w:sz w:val="32"/>
+          <w:szCs w:val="32"/>
         </w:rPr>
         <w:t>COMP2006: Security Architectures and Cryptography</w:t>
       </w:r>
@@ -32,8 +32,8 @@
         <w:rPr>
           <w:rFonts w:ascii="Palatino Linotype" w:hAnsi="Palatino Linotype"/>
           <w:color w:val="000000" w:themeColor="text1"/>
-          <w:sz w:val="24"/>
-          <w:szCs w:val="24"/>
+          <w:sz w:val="32"/>
+          <w:szCs w:val="32"/>
         </w:rPr>
       </w:pPr>
       <w:r>
@@ -42,8 +42,8 @@
           <w:b/>
           <w:bCs/>
           <w:color w:val="000000" w:themeColor="text1"/>
-          <w:sz w:val="24"/>
-          <w:szCs w:val="24"/>
+          <w:sz w:val="32"/>
+          <w:szCs w:val="32"/>
         </w:rPr>
         <w:t>Assessment 2: Report (70%)</w:t>
       </w:r>
@@ -55,16 +55,16 @@
         <w:rPr>
           <w:rFonts w:ascii="Palatino Linotype" w:hAnsi="Palatino Linotype"/>
           <w:color w:val="000000" w:themeColor="text1"/>
-          <w:sz w:val="24"/>
-          <w:szCs w:val="24"/>
-        </w:rPr>
-      </w:pPr>
-      <w:r>
-        <w:rPr>
-          <w:rFonts w:ascii="Palatino Linotype" w:hAnsi="Palatino Linotype"/>
-          <w:color w:val="000000" w:themeColor="text1"/>
-          <w:sz w:val="24"/>
-          <w:szCs w:val="24"/>
+          <w:sz w:val="32"/>
+          <w:szCs w:val="32"/>
+        </w:rPr>
+      </w:pPr>
+      <w:r>
+        <w:rPr>
+          <w:rFonts w:ascii="Palatino Linotype" w:hAnsi="Palatino Linotype"/>
+          <w:color w:val="000000" w:themeColor="text1"/>
+          <w:sz w:val="32"/>
+          <w:szCs w:val="32"/>
         </w:rPr>
         <w:t>Authentication Mechanisms for Company X Password Manager</w:t>
       </w:r>
@@ -76,16 +76,16 @@
         <w:rPr>
           <w:rFonts w:ascii="Palatino Linotype" w:hAnsi="Palatino Linotype"/>
           <w:color w:val="000000" w:themeColor="text1"/>
-          <w:sz w:val="24"/>
-          <w:szCs w:val="24"/>
-        </w:rPr>
-      </w:pPr>
-      <w:r>
-        <w:rPr>
-          <w:rFonts w:ascii="Palatino Linotype" w:hAnsi="Palatino Linotype"/>
-          <w:color w:val="000000" w:themeColor="text1"/>
-          <w:sz w:val="24"/>
-          <w:szCs w:val="24"/>
+          <w:sz w:val="32"/>
+          <w:szCs w:val="32"/>
+        </w:rPr>
+      </w:pPr>
+      <w:r>
+        <w:rPr>
+          <w:rFonts w:ascii="Palatino Linotype" w:hAnsi="Palatino Linotype"/>
+          <w:color w:val="000000" w:themeColor="text1"/>
+          <w:sz w:val="32"/>
+          <w:szCs w:val="32"/>
         </w:rPr>
         <w:t>Module Leader: Dr Hai Van Dang</w:t>
       </w:r>
@@ -97,16 +97,16 @@
         <w:rPr>
           <w:rFonts w:ascii="Palatino Linotype" w:hAnsi="Palatino Linotype"/>
           <w:color w:val="000000" w:themeColor="text1"/>
-          <w:sz w:val="24"/>
-          <w:szCs w:val="24"/>
-        </w:rPr>
-      </w:pPr>
-      <w:r>
-        <w:rPr>
-          <w:rFonts w:ascii="Palatino Linotype" w:hAnsi="Palatino Linotype"/>
-          <w:color w:val="000000" w:themeColor="text1"/>
-          <w:sz w:val="24"/>
-          <w:szCs w:val="24"/>
+          <w:sz w:val="32"/>
+          <w:szCs w:val="32"/>
+        </w:rPr>
+      </w:pPr>
+      <w:r>
+        <w:rPr>
+          <w:rFonts w:ascii="Palatino Linotype" w:hAnsi="Palatino Linotype"/>
+          <w:color w:val="000000" w:themeColor="text1"/>
+          <w:sz w:val="32"/>
+          <w:szCs w:val="32"/>
         </w:rPr>
         <w:t>Submission Deadline: 5th May 2026</w:t>
       </w:r>
@@ -118,24 +118,24 @@
         <w:rPr>
           <w:rFonts w:ascii="Palatino Linotype" w:hAnsi="Palatino Linotype"/>
           <w:color w:val="000000" w:themeColor="text1"/>
-          <w:sz w:val="24"/>
-          <w:szCs w:val="24"/>
-        </w:rPr>
-      </w:pPr>
-      <w:r>
-        <w:rPr>
-          <w:rFonts w:ascii="Palatino Linotype" w:hAnsi="Palatino Linotype"/>
-          <w:color w:val="000000" w:themeColor="text1"/>
-          <w:sz w:val="24"/>
-          <w:szCs w:val="24"/>
+          <w:sz w:val="32"/>
+          <w:szCs w:val="32"/>
+        </w:rPr>
+      </w:pPr>
+      <w:r>
+        <w:rPr>
+          <w:rFonts w:ascii="Palatino Linotype" w:hAnsi="Palatino Linotype"/>
+          <w:color w:val="000000" w:themeColor="text1"/>
+          <w:sz w:val="32"/>
+          <w:szCs w:val="32"/>
         </w:rPr>
         <w:t>GitHub :</w:t>
       </w:r>
       <w:r>
         <w:rPr>
           <w:rFonts w:ascii="Palatino Linotype" w:hAnsi="Palatino Linotype"/>
-          <w:sz w:val="24"/>
-          <w:szCs w:val="24"/>
+          <w:sz w:val="32"/>
+          <w:szCs w:val="32"/>
         </w:rPr>
         <w:t xml:space="preserve"> </w:t>
       </w:r>
@@ -143,8 +143,8 @@
         <w:rPr>
           <w:rFonts w:ascii="Palatino Linotype" w:hAnsi="Palatino Linotype"/>
           <w:color w:val="000000" w:themeColor="text1"/>
-          <w:sz w:val="24"/>
-          <w:szCs w:val="24"/>
+          <w:sz w:val="32"/>
+          <w:szCs w:val="32"/>
         </w:rPr>
         <w:t>https://github.com/OkyanusAlbas</w:t>
       </w:r>
@@ -156,8 +156,8 @@
         <w:rPr>
           <w:rFonts w:ascii="Palatino Linotype" w:hAnsi="Palatino Linotype"/>
           <w:color w:val="000000" w:themeColor="text1"/>
-          <w:sz w:val="24"/>
-          <w:szCs w:val="24"/>
+          <w:sz w:val="32"/>
+          <w:szCs w:val="32"/>
         </w:rPr>
       </w:pPr>
     </w:p>
@@ -188,16 +188,16 @@
         <w:rPr>
           <w:rFonts w:ascii="Palatino Linotype" w:hAnsi="Palatino Linotype"/>
           <w:color w:val="000000" w:themeColor="text1"/>
-          <w:sz w:val="24"/>
-          <w:szCs w:val="24"/>
-        </w:rPr>
-      </w:pPr>
-      <w:r>
-        <w:rPr>
-          <w:rFonts w:ascii="Palatino Linotype" w:hAnsi="Palatino Linotype"/>
-          <w:color w:val="000000" w:themeColor="text1"/>
-          <w:sz w:val="24"/>
-          <w:szCs w:val="24"/>
+          <w:sz w:val="32"/>
+          <w:szCs w:val="32"/>
+        </w:rPr>
+      </w:pPr>
+      <w:r>
+        <w:rPr>
+          <w:rFonts w:ascii="Palatino Linotype" w:hAnsi="Palatino Linotype"/>
+          <w:color w:val="000000" w:themeColor="text1"/>
+          <w:sz w:val="32"/>
+          <w:szCs w:val="32"/>
         </w:rPr>
         <w:lastRenderedPageBreak/>
         <w:t>1. Introduction</w:t>
@@ -326,19 +326,19 @@
         <w:rPr>
           <w:rFonts w:ascii="Palatino Linotype" w:hAnsi="Palatino Linotype"/>
           <w:color w:val="000000" w:themeColor="text1"/>
-          <w:sz w:val="24"/>
-          <w:szCs w:val="24"/>
-        </w:rPr>
-      </w:pPr>
-      <w:r>
-        <w:rPr>
-          <w:rFonts w:ascii="Palatino Linotype" w:hAnsi="Palatino Linotype"/>
-          <w:color w:val="000000" w:themeColor="text1"/>
-          <w:sz w:val="24"/>
-          <w:szCs w:val="24"/>
+          <w:sz w:val="32"/>
+          <w:szCs w:val="32"/>
+        </w:rPr>
+      </w:pPr>
+      <w:r>
+        <w:rPr>
+          <w:rFonts w:ascii="Palatino Linotype" w:hAnsi="Palatino Linotype"/>
+          <w:color w:val="000000" w:themeColor="text1"/>
+          <w:sz w:val="32"/>
+          <w:szCs w:val="32"/>
         </w:rPr>
         <w:lastRenderedPageBreak/>
-        <w:t>2. Section 1 – Authentication Mechanisms</w:t>
+        <w:t>2. Section 1 Authentication Mechanisms</w:t>
       </w:r>
     </w:p>
     <w:p>
@@ -441,7 +441,27 @@
           <w:sz w:val="24"/>
           <w:szCs w:val="24"/>
         </w:rPr>
-        <w:t>SRP-6a is an established IETF standard (RFC 2945 and RFC 5054 for TLS integration) and is used in production systems including ProtonMail and 1Password. The mechanism operates over TLS 1.3, which provides transport confidentiality and prevents passive interception.</w:t>
+        <w:t xml:space="preserve">SRP-6a is an established IETF standard (RFC 2945 and RFC 5054 for TLS integration) and is used in production systems including </w:t>
+      </w:r>
+      <w:proofErr w:type="spellStart"/>
+      <w:r>
+        <w:rPr>
+          <w:rFonts w:ascii="Palatino Linotype" w:hAnsi="Palatino Linotype"/>
+          <w:color w:val="000000" w:themeColor="text1"/>
+          <w:sz w:val="24"/>
+          <w:szCs w:val="24"/>
+        </w:rPr>
+        <w:t>ProtonMail</w:t>
+      </w:r>
+      <w:proofErr w:type="spellEnd"/>
+      <w:r>
+        <w:rPr>
+          <w:rFonts w:ascii="Palatino Linotype" w:hAnsi="Palatino Linotype"/>
+          <w:color w:val="000000" w:themeColor="text1"/>
+          <w:sz w:val="24"/>
+          <w:szCs w:val="24"/>
+        </w:rPr>
+        <w:t xml:space="preserve"> and 1Password. The mechanism operates over TLS 1.3, which provides transport confidentiality and prevents passive interception.</w:t>
       </w:r>
     </w:p>
     <w:p>
@@ -754,7 +774,27 @@
           <w:sz w:val="24"/>
           <w:szCs w:val="24"/>
         </w:rPr>
-        <w:t>Client computes the verifier: v = g^x mod N.</w:t>
+        <w:t xml:space="preserve">Client computes the verifier: v = </w:t>
+      </w:r>
+      <w:proofErr w:type="spellStart"/>
+      <w:r>
+        <w:rPr>
+          <w:rFonts w:ascii="Palatino Linotype" w:hAnsi="Palatino Linotype"/>
+          <w:color w:val="000000" w:themeColor="text1"/>
+          <w:sz w:val="24"/>
+          <w:szCs w:val="24"/>
+        </w:rPr>
+        <w:t>g^x</w:t>
+      </w:r>
+      <w:proofErr w:type="spellEnd"/>
+      <w:r>
+        <w:rPr>
+          <w:rFonts w:ascii="Palatino Linotype" w:hAnsi="Palatino Linotype"/>
+          <w:color w:val="000000" w:themeColor="text1"/>
+          <w:sz w:val="24"/>
+          <w:szCs w:val="24"/>
+        </w:rPr>
+        <w:t xml:space="preserve"> mod N.</w:t>
       </w:r>
     </w:p>
     <w:p>
@@ -1019,7 +1059,27 @@
                 <w:sz w:val="24"/>
                 <w:szCs w:val="24"/>
               </w:rPr>
-              <w:t>Generate ephemeral private key a; compute A = g^a mod N</w:t>
+              <w:t xml:space="preserve">Generate ephemeral private key a; compute A = </w:t>
+            </w:r>
+            <w:proofErr w:type="spellStart"/>
+            <w:r>
+              <w:rPr>
+                <w:rFonts w:ascii="Palatino Linotype" w:hAnsi="Palatino Linotype"/>
+                <w:color w:val="000000" w:themeColor="text1"/>
+                <w:sz w:val="24"/>
+                <w:szCs w:val="24"/>
+              </w:rPr>
+              <w:t>g^a</w:t>
+            </w:r>
+            <w:proofErr w:type="spellEnd"/>
+            <w:r>
+              <w:rPr>
+                <w:rFonts w:ascii="Palatino Linotype" w:hAnsi="Palatino Linotype"/>
+                <w:color w:val="000000" w:themeColor="text1"/>
+                <w:sz w:val="24"/>
+                <w:szCs w:val="24"/>
+              </w:rPr>
+              <w:t xml:space="preserve"> mod N</w:t>
             </w:r>
           </w:p>
         </w:tc>
@@ -1213,7 +1273,47 @@
                 <w:sz w:val="24"/>
                 <w:szCs w:val="24"/>
               </w:rPr>
-              <w:t>Generate ephemeral private key b; compute B = kv + g^b mod N; send {B, s}</w:t>
+              <w:t xml:space="preserve">Generate ephemeral private key b; compute B = </w:t>
+            </w:r>
+            <w:proofErr w:type="spellStart"/>
+            <w:r>
+              <w:rPr>
+                <w:rFonts w:ascii="Palatino Linotype" w:hAnsi="Palatino Linotype"/>
+                <w:color w:val="000000" w:themeColor="text1"/>
+                <w:sz w:val="24"/>
+                <w:szCs w:val="24"/>
+              </w:rPr>
+              <w:t>kv</w:t>
+            </w:r>
+            <w:proofErr w:type="spellEnd"/>
+            <w:r>
+              <w:rPr>
+                <w:rFonts w:ascii="Palatino Linotype" w:hAnsi="Palatino Linotype"/>
+                <w:color w:val="000000" w:themeColor="text1"/>
+                <w:sz w:val="24"/>
+                <w:szCs w:val="24"/>
+              </w:rPr>
+              <w:t xml:space="preserve"> + </w:t>
+            </w:r>
+            <w:proofErr w:type="spellStart"/>
+            <w:r>
+              <w:rPr>
+                <w:rFonts w:ascii="Palatino Linotype" w:hAnsi="Palatino Linotype"/>
+                <w:color w:val="000000" w:themeColor="text1"/>
+                <w:sz w:val="24"/>
+                <w:szCs w:val="24"/>
+              </w:rPr>
+              <w:t>g^b</w:t>
+            </w:r>
+            <w:proofErr w:type="spellEnd"/>
+            <w:r>
+              <w:rPr>
+                <w:rFonts w:ascii="Palatino Linotype" w:hAnsi="Palatino Linotype"/>
+                <w:color w:val="000000" w:themeColor="text1"/>
+                <w:sz w:val="24"/>
+                <w:szCs w:val="24"/>
+              </w:rPr>
+              <w:t xml:space="preserve"> mod N; send {B, s}</w:t>
             </w:r>
           </w:p>
         </w:tc>
@@ -1267,7 +1367,107 @@
                 <w:sz w:val="24"/>
                 <w:szCs w:val="24"/>
               </w:rPr>
-              <w:t>Compute u = H(A || B); compute x = H(s || H(MP)); compute session key S_c = (B - kg^x)^(a + ux) mod N; derive K_c = H(S_c)</w:t>
+              <w:t xml:space="preserve">Compute u = H(A || B); compute x = H(s || H(MP)); compute session key </w:t>
+            </w:r>
+            <w:proofErr w:type="spellStart"/>
+            <w:r>
+              <w:rPr>
+                <w:rFonts w:ascii="Palatino Linotype" w:hAnsi="Palatino Linotype"/>
+                <w:color w:val="000000" w:themeColor="text1"/>
+                <w:sz w:val="24"/>
+                <w:szCs w:val="24"/>
+              </w:rPr>
+              <w:t>S_c</w:t>
+            </w:r>
+            <w:proofErr w:type="spellEnd"/>
+            <w:r>
+              <w:rPr>
+                <w:rFonts w:ascii="Palatino Linotype" w:hAnsi="Palatino Linotype"/>
+                <w:color w:val="000000" w:themeColor="text1"/>
+                <w:sz w:val="24"/>
+                <w:szCs w:val="24"/>
+              </w:rPr>
+              <w:t xml:space="preserve"> = (B - </w:t>
+            </w:r>
+            <w:proofErr w:type="spellStart"/>
+            <w:r>
+              <w:rPr>
+                <w:rFonts w:ascii="Palatino Linotype" w:hAnsi="Palatino Linotype"/>
+                <w:color w:val="000000" w:themeColor="text1"/>
+                <w:sz w:val="24"/>
+                <w:szCs w:val="24"/>
+              </w:rPr>
+              <w:t>kg^x</w:t>
+            </w:r>
+            <w:proofErr w:type="spellEnd"/>
+            <w:r>
+              <w:rPr>
+                <w:rFonts w:ascii="Palatino Linotype" w:hAnsi="Palatino Linotype"/>
+                <w:color w:val="000000" w:themeColor="text1"/>
+                <w:sz w:val="24"/>
+                <w:szCs w:val="24"/>
+              </w:rPr>
+              <w:t xml:space="preserve">)^(a + </w:t>
+            </w:r>
+            <w:proofErr w:type="spellStart"/>
+            <w:r>
+              <w:rPr>
+                <w:rFonts w:ascii="Palatino Linotype" w:hAnsi="Palatino Linotype"/>
+                <w:color w:val="000000" w:themeColor="text1"/>
+                <w:sz w:val="24"/>
+                <w:szCs w:val="24"/>
+              </w:rPr>
+              <w:t>ux</w:t>
+            </w:r>
+            <w:proofErr w:type="spellEnd"/>
+            <w:r>
+              <w:rPr>
+                <w:rFonts w:ascii="Palatino Linotype" w:hAnsi="Palatino Linotype"/>
+                <w:color w:val="000000" w:themeColor="text1"/>
+                <w:sz w:val="24"/>
+                <w:szCs w:val="24"/>
+              </w:rPr>
+              <w:t xml:space="preserve">) mod N; derive </w:t>
+            </w:r>
+            <w:proofErr w:type="spellStart"/>
+            <w:r>
+              <w:rPr>
+                <w:rFonts w:ascii="Palatino Linotype" w:hAnsi="Palatino Linotype"/>
+                <w:color w:val="000000" w:themeColor="text1"/>
+                <w:sz w:val="24"/>
+                <w:szCs w:val="24"/>
+              </w:rPr>
+              <w:t>K_c</w:t>
+            </w:r>
+            <w:proofErr w:type="spellEnd"/>
+            <w:r>
+              <w:rPr>
+                <w:rFonts w:ascii="Palatino Linotype" w:hAnsi="Palatino Linotype"/>
+                <w:color w:val="000000" w:themeColor="text1"/>
+                <w:sz w:val="24"/>
+                <w:szCs w:val="24"/>
+              </w:rPr>
+              <w:t xml:space="preserve"> = H(</w:t>
+            </w:r>
+            <w:proofErr w:type="spellStart"/>
+            <w:r>
+              <w:rPr>
+                <w:rFonts w:ascii="Palatino Linotype" w:hAnsi="Palatino Linotype"/>
+                <w:color w:val="000000" w:themeColor="text1"/>
+                <w:sz w:val="24"/>
+                <w:szCs w:val="24"/>
+              </w:rPr>
+              <w:t>S_c</w:t>
+            </w:r>
+            <w:proofErr w:type="spellEnd"/>
+            <w:r>
+              <w:rPr>
+                <w:rFonts w:ascii="Palatino Linotype" w:hAnsi="Palatino Linotype"/>
+                <w:color w:val="000000" w:themeColor="text1"/>
+                <w:sz w:val="24"/>
+                <w:szCs w:val="24"/>
+              </w:rPr>
+              <w:t>)</w:t>
             </w:r>
           </w:p>
         </w:tc>
@@ -1293,7 +1493,27 @@
                 <w:sz w:val="24"/>
                 <w:szCs w:val="24"/>
               </w:rPr>
-              <w:t>Client computes K_c locally</w:t>
+              <w:t xml:space="preserve">Client computes </w:t>
+            </w:r>
+            <w:proofErr w:type="spellStart"/>
+            <w:r>
+              <w:rPr>
+                <w:rFonts w:ascii="Palatino Linotype" w:hAnsi="Palatino Linotype"/>
+                <w:color w:val="000000" w:themeColor="text1"/>
+                <w:sz w:val="24"/>
+                <w:szCs w:val="24"/>
+              </w:rPr>
+              <w:t>K_c</w:t>
+            </w:r>
+            <w:proofErr w:type="spellEnd"/>
+            <w:r>
+              <w:rPr>
+                <w:rFonts w:ascii="Palatino Linotype" w:hAnsi="Palatino Linotype"/>
+                <w:color w:val="000000" w:themeColor="text1"/>
+                <w:sz w:val="24"/>
+                <w:szCs w:val="24"/>
+              </w:rPr>
+              <w:t xml:space="preserve"> locally</w:t>
             </w:r>
           </w:p>
         </w:tc>
@@ -1319,7 +1539,27 @@
                 <w:sz w:val="24"/>
                 <w:szCs w:val="24"/>
               </w:rPr>
-              <w:t>Compute u = H(A || B); compute session key S_s = (Av^u)^b mod N; derive K_s = H(S_s)</w:t>
+              <w:t>Compute u = H(A || B); compute session key S_s = (</w:t>
+            </w:r>
+            <w:proofErr w:type="spellStart"/>
+            <w:r>
+              <w:rPr>
+                <w:rFonts w:ascii="Palatino Linotype" w:hAnsi="Palatino Linotype"/>
+                <w:color w:val="000000" w:themeColor="text1"/>
+                <w:sz w:val="24"/>
+                <w:szCs w:val="24"/>
+              </w:rPr>
+              <w:t>Av^u</w:t>
+            </w:r>
+            <w:proofErr w:type="spellEnd"/>
+            <w:r>
+              <w:rPr>
+                <w:rFonts w:ascii="Palatino Linotype" w:hAnsi="Palatino Linotype"/>
+                <w:color w:val="000000" w:themeColor="text1"/>
+                <w:sz w:val="24"/>
+                <w:szCs w:val="24"/>
+              </w:rPr>
+              <w:t>)^b mod N; derive K_s = H(S_s)</w:t>
             </w:r>
           </w:p>
         </w:tc>
@@ -1373,7 +1613,27 @@
                 <w:sz w:val="24"/>
                 <w:szCs w:val="24"/>
               </w:rPr>
-              <w:t>Send proof: M1 = H(H(N) XOR H(g) || H(username) || s || A || B || K_c)</w:t>
+              <w:t xml:space="preserve">Send proof: M1 = H(H(N) XOR H(g) || H(username) || s || A || B || </w:t>
+            </w:r>
+            <w:proofErr w:type="spellStart"/>
+            <w:r>
+              <w:rPr>
+                <w:rFonts w:ascii="Palatino Linotype" w:hAnsi="Palatino Linotype"/>
+                <w:color w:val="000000" w:themeColor="text1"/>
+                <w:sz w:val="24"/>
+                <w:szCs w:val="24"/>
+              </w:rPr>
+              <w:t>K_c</w:t>
+            </w:r>
+            <w:proofErr w:type="spellEnd"/>
+            <w:r>
+              <w:rPr>
+                <w:rFonts w:ascii="Palatino Linotype" w:hAnsi="Palatino Linotype"/>
+                <w:color w:val="000000" w:themeColor="text1"/>
+                <w:sz w:val="24"/>
+                <w:szCs w:val="24"/>
+              </w:rPr>
+              <w:t>)</w:t>
             </w:r>
           </w:p>
         </w:tc>
@@ -1576,18 +1836,7 @@
     <w:p>
       <w:pPr>
         <w:spacing w:before="80" w:after="120"/>
-        <w:jc w:val="center"/>
-        <w:rPr>
-          <w:rFonts w:ascii="Palatino Linotype" w:hAnsi="Palatino Linotype"/>
-          <w:color w:val="000000" w:themeColor="text1"/>
-          <w:sz w:val="24"/>
-          <w:szCs w:val="24"/>
-        </w:rPr>
-      </w:pPr>
-    </w:p>
-    <w:p>
-      <w:pPr>
-        <w:spacing w:before="80" w:after="120"/>
+        <w:ind w:left="720" w:firstLine="720"/>
         <w:jc w:val="center"/>
         <w:rPr>
           <w:rFonts w:ascii="Palatino Linotype" w:hAnsi="Palatino Linotype"/>
@@ -1649,8 +1898,29 @@
           <w:sz w:val="24"/>
           <w:szCs w:val="24"/>
         </w:rPr>
-        <w:t xml:space="preserve">The Server stores only the verifier v = g^x mod N, not the password itself. An attacker who compromises the Server database cannot recover MP from v without solving the discrete logarithm problem, which is computationally infeasible for large prime N (e.g., 4096-bit). An attacker impersonating the Server would need to produce a valid M2, which requires K_s  only derivable with knowledge of v and b. </w:t>
-      </w:r>
+        <w:t xml:space="preserve">The Server stores only the verifier v = </w:t>
+      </w:r>
+      <w:proofErr w:type="spellStart"/>
+      <w:r>
+        <w:rPr>
+          <w:rFonts w:ascii="Palatino Linotype" w:hAnsi="Palatino Linotype"/>
+          <w:color w:val="000000" w:themeColor="text1"/>
+          <w:sz w:val="24"/>
+          <w:szCs w:val="24"/>
+        </w:rPr>
+        <w:t>g^x</w:t>
+      </w:r>
+      <w:proofErr w:type="spellEnd"/>
+      <w:r>
+        <w:rPr>
+          <w:rFonts w:ascii="Palatino Linotype" w:hAnsi="Palatino Linotype"/>
+          <w:color w:val="000000" w:themeColor="text1"/>
+          <w:sz w:val="24"/>
+          <w:szCs w:val="24"/>
+        </w:rPr>
+        <w:t xml:space="preserve"> mod N, not the password itself. An attacker who compromises the Server database cannot recover MP from v without solving the discrete logarithm problem, which is computationally infeasible for large prime N (e.g., 4096-bit). An attacker impersonating the Server would need to produce a valid M2, which requires K_s  only derivable with knowledge of v and b. An attacker impersonating the Client would need to produce M1, which requires </w:t>
+      </w:r>
+      <w:proofErr w:type="spellStart"/>
       <w:r>
         <w:rPr>
           <w:rFonts w:ascii="Palatino Linotype" w:hAnsi="Palatino Linotype"/>
@@ -1659,7 +1929,35 @@
           <w:szCs w:val="24"/>
         </w:rPr>
         <w:lastRenderedPageBreak/>
-        <w:t>An attacker impersonating the Client would need to produce M1, which requires K_c — only derivable with knowledge of MP. Neither can be forged without the respective secret, making mutual authentication robust against impersonation.</w:t>
+        <w:t>K_c</w:t>
+      </w:r>
+      <w:proofErr w:type="spellEnd"/>
+      <w:r>
+        <w:rPr>
+          <w:rFonts w:ascii="Palatino Linotype" w:hAnsi="Palatino Linotype"/>
+          <w:color w:val="000000" w:themeColor="text1"/>
+          <w:sz w:val="24"/>
+          <w:szCs w:val="24"/>
+        </w:rPr>
+        <w:t xml:space="preserve"> </w:t>
+      </w:r>
+      <w:r>
+        <w:rPr>
+          <w:rFonts w:ascii="Palatino Linotype" w:hAnsi="Palatino Linotype"/>
+          <w:color w:val="000000" w:themeColor="text1"/>
+          <w:sz w:val="24"/>
+          <w:szCs w:val="24"/>
+        </w:rPr>
+        <w:t>-</w:t>
+      </w:r>
+      <w:r>
+        <w:rPr>
+          <w:rFonts w:ascii="Palatino Linotype" w:hAnsi="Palatino Linotype"/>
+          <w:color w:val="000000" w:themeColor="text1"/>
+          <w:sz w:val="24"/>
+          <w:szCs w:val="24"/>
+        </w:rPr>
+        <w:t xml:space="preserve"> only derivable with knowledge of MP. Neither can be forged without the respective secret, making mutual authentication robust against impersonation.</w:t>
       </w:r>
     </w:p>
     <w:p>
@@ -2493,7 +2791,25 @@
           <w:sz w:val="24"/>
           <w:szCs w:val="24"/>
         </w:rPr>
-        <w:t>A custom HMAC-SHA256 challenge-response protocol is proposed for authentication between the Server and the Password Vault. Unlike the Client-Server channel, this is a server-to-server communication where no user is involved and user authentication is inappropriate (as noted in the brief). The Vault must verify that requests originate exclusively from the legitimate Server and not from an attacker who has compromised a different component of the system.</w:t>
+        <w:t xml:space="preserve">A custom HMAC-SHA256 challenge-response protocol is proposed for authentication between the Server and the Password Vault. Unlike the Client-Server channel, this is a server-to-server communication where no user is </w:t>
+      </w:r>
+      <w:r>
+        <w:rPr>
+          <w:rFonts w:ascii="Palatino Linotype" w:hAnsi="Palatino Linotype"/>
+          <w:color w:val="000000" w:themeColor="text1"/>
+          <w:sz w:val="24"/>
+          <w:szCs w:val="24"/>
+        </w:rPr>
+        <w:t>involved,</w:t>
+      </w:r>
+      <w:r>
+        <w:rPr>
+          <w:rFonts w:ascii="Palatino Linotype" w:hAnsi="Palatino Linotype"/>
+          <w:color w:val="000000" w:themeColor="text1"/>
+          <w:sz w:val="24"/>
+          <w:szCs w:val="24"/>
+        </w:rPr>
+        <w:t xml:space="preserve"> and user authentication is inappropriate (as noted in the brief). The Vault must verify that requests originate exclusively from the legitimate Server and not from an attacker who has compromised a different component of the system.</w:t>
       </w:r>
     </w:p>
     <w:p>
@@ -2548,7 +2864,6 @@
           <w:numId w:val="2"/>
         </w:numPr>
         <w:spacing w:before="40" w:after="40"/>
-        <w:jc w:val="center"/>
         <w:rPr>
           <w:rFonts w:ascii="Palatino Linotype" w:hAnsi="Palatino Linotype"/>
           <w:color w:val="000000" w:themeColor="text1"/>
@@ -2574,7 +2889,6 @@
           <w:numId w:val="2"/>
         </w:numPr>
         <w:spacing w:before="40" w:after="40"/>
-        <w:jc w:val="center"/>
         <w:rPr>
           <w:rFonts w:ascii="Palatino Linotype" w:hAnsi="Palatino Linotype"/>
           <w:color w:val="000000" w:themeColor="text1"/>
@@ -2600,22 +2914,39 @@
           <w:numId w:val="2"/>
         </w:numPr>
         <w:spacing w:before="40" w:after="40"/>
-        <w:jc w:val="center"/>
-        <w:rPr>
-          <w:rFonts w:ascii="Palatino Linotype" w:hAnsi="Palatino Linotype"/>
-          <w:color w:val="000000" w:themeColor="text1"/>
-          <w:sz w:val="24"/>
-          <w:szCs w:val="24"/>
-        </w:rPr>
-      </w:pPr>
-      <w:r>
-        <w:rPr>
-          <w:rFonts w:ascii="Palatino Linotype" w:hAnsi="Palatino Linotype"/>
-          <w:color w:val="000000" w:themeColor="text1"/>
-          <w:sz w:val="24"/>
-          <w:szCs w:val="24"/>
-        </w:rPr>
-        <w:t>Both components have access to a monotonic clock synchronised via NTP to within ±30 seconds.</w:t>
+        <w:rPr>
+          <w:rFonts w:ascii="Palatino Linotype" w:hAnsi="Palatino Linotype"/>
+          <w:color w:val="000000" w:themeColor="text1"/>
+          <w:sz w:val="24"/>
+          <w:szCs w:val="24"/>
+        </w:rPr>
+      </w:pPr>
+      <w:r>
+        <w:rPr>
+          <w:rFonts w:ascii="Palatino Linotype" w:hAnsi="Palatino Linotype"/>
+          <w:color w:val="000000" w:themeColor="text1"/>
+          <w:sz w:val="24"/>
+          <w:szCs w:val="24"/>
+        </w:rPr>
+        <w:t xml:space="preserve">Both components have access to a monotonic clock synchronised via NTP to within </w:t>
+      </w:r>
+      <w:r>
+        <w:rPr>
+          <w:rFonts w:ascii="Palatino Linotype" w:hAnsi="Palatino Linotype"/>
+          <w:color w:val="000000" w:themeColor="text1"/>
+          <w:sz w:val="24"/>
+          <w:szCs w:val="24"/>
+        </w:rPr>
+        <w:t>+-</w:t>
+      </w:r>
+      <w:r>
+        <w:rPr>
+          <w:rFonts w:ascii="Palatino Linotype" w:hAnsi="Palatino Linotype"/>
+          <w:color w:val="000000" w:themeColor="text1"/>
+          <w:sz w:val="24"/>
+          <w:szCs w:val="24"/>
+        </w:rPr>
+        <w:t>30 seconds.</w:t>
       </w:r>
     </w:p>
     <w:p>
@@ -2626,7 +2957,6 @@
           <w:numId w:val="2"/>
         </w:numPr>
         <w:spacing w:before="40" w:after="40"/>
-        <w:jc w:val="center"/>
         <w:rPr>
           <w:rFonts w:ascii="Palatino Linotype" w:hAnsi="Palatino Linotype"/>
           <w:color w:val="000000" w:themeColor="text1"/>
@@ -2652,7 +2982,6 @@
           <w:numId w:val="2"/>
         </w:numPr>
         <w:spacing w:before="40" w:after="40"/>
-        <w:jc w:val="center"/>
         <w:rPr>
           <w:rFonts w:ascii="Palatino Linotype" w:hAnsi="Palatino Linotype"/>
           <w:color w:val="000000" w:themeColor="text1"/>
@@ -2690,7 +3019,7 @@
           <w:sz w:val="24"/>
           <w:szCs w:val="24"/>
         </w:rPr>
-        <w:t>2.2.3 Protocol Steps — Full Message Flow</w:t>
+        <w:t>2.2.3 Protocol Steps  Full Message Flow</w:t>
       </w:r>
     </w:p>
     <w:p>
@@ -2716,50 +3045,24 @@
     </w:p>
     <w:tbl>
       <w:tblPr>
-        <w:tblW w:w="9026" w:type="dxa"/>
-        <w:tblBorders>
-          <w:top w:val="single" w:sz="4" w:space="0" w:color="auto"/>
-          <w:left w:val="single" w:sz="4" w:space="0" w:color="auto"/>
-          <w:bottom w:val="single" w:sz="4" w:space="0" w:color="auto"/>
-          <w:right w:val="single" w:sz="4" w:space="0" w:color="auto"/>
-          <w:insideH w:val="single" w:sz="4" w:space="0" w:color="auto"/>
-          <w:insideV w:val="single" w:sz="4" w:space="0" w:color="auto"/>
-        </w:tblBorders>
-        <w:tblCellMar>
-          <w:left w:w="10" w:type="dxa"/>
-          <w:right w:w="10" w:type="dxa"/>
-        </w:tblCellMar>
+        <w:tblStyle w:val="TableGrid"/>
+        <w:tblW w:w="9536" w:type="dxa"/>
         <w:tblLook w:val="04A0" w:firstRow="1" w:lastRow="0" w:firstColumn="1" w:lastColumn="0" w:noHBand="0" w:noVBand="1"/>
       </w:tblPr>
       <w:tblGrid>
-        <w:gridCol w:w="775"/>
-        <w:gridCol w:w="1916"/>
-        <w:gridCol w:w="3175"/>
-        <w:gridCol w:w="3160"/>
+        <w:gridCol w:w="2156"/>
+        <w:gridCol w:w="2167"/>
+        <w:gridCol w:w="2703"/>
+        <w:gridCol w:w="2510"/>
       </w:tblGrid>
       <w:tr>
-        <w:trPr>
-          <w:tblHeader/>
-        </w:trPr>
-        <w:tc>
-          <w:tcPr>
-            <w:tcW w:w="600" w:type="dxa"/>
-            <w:tcBorders>
-              <w:top w:val="single" w:sz="1" w:space="0" w:color="2E4057"/>
-              <w:left w:val="single" w:sz="1" w:space="0" w:color="2E4057"/>
-              <w:bottom w:val="single" w:sz="1" w:space="0" w:color="2E4057"/>
-              <w:right w:val="single" w:sz="1" w:space="0" w:color="2E4057"/>
-            </w:tcBorders>
-            <w:shd w:val="clear" w:color="auto" w:fill="2E4057"/>
-            <w:tcMar>
-              <w:top w:w="100" w:type="dxa"/>
-              <w:left w:w="140" w:type="dxa"/>
-              <w:bottom w:w="100" w:type="dxa"/>
-              <w:right w:w="140" w:type="dxa"/>
-            </w:tcMar>
-          </w:tcPr>
-          <w:p>
-            <w:pPr>
+        <w:tc>
+          <w:tcPr>
+            <w:tcW w:w="2156" w:type="dxa"/>
+          </w:tcPr>
+          <w:p>
+            <w:pPr>
+              <w:spacing w:before="80" w:after="120"/>
               <w:jc w:val="center"/>
               <w:rPr>
                 <w:rFonts w:ascii="Palatino Linotype" w:hAnsi="Palatino Linotype"/>
@@ -2783,23 +3086,11 @@
         </w:tc>
         <w:tc>
           <w:tcPr>
-            <w:tcW w:w="2000" w:type="dxa"/>
-            <w:tcBorders>
-              <w:top w:val="single" w:sz="1" w:space="0" w:color="2E4057"/>
-              <w:left w:val="single" w:sz="1" w:space="0" w:color="2E4057"/>
-              <w:bottom w:val="single" w:sz="1" w:space="0" w:color="2E4057"/>
-              <w:right w:val="single" w:sz="1" w:space="0" w:color="2E4057"/>
-            </w:tcBorders>
-            <w:shd w:val="clear" w:color="auto" w:fill="2E4057"/>
-            <w:tcMar>
-              <w:top w:w="100" w:type="dxa"/>
-              <w:left w:w="140" w:type="dxa"/>
-              <w:bottom w:w="100" w:type="dxa"/>
-              <w:right w:w="140" w:type="dxa"/>
-            </w:tcMar>
-          </w:tcPr>
-          <w:p>
-            <w:pPr>
+            <w:tcW w:w="2167" w:type="dxa"/>
+          </w:tcPr>
+          <w:p>
+            <w:pPr>
+              <w:spacing w:before="80" w:after="120"/>
               <w:jc w:val="center"/>
               <w:rPr>
                 <w:rFonts w:ascii="Palatino Linotype" w:hAnsi="Palatino Linotype"/>
@@ -2823,23 +3114,11 @@
         </w:tc>
         <w:tc>
           <w:tcPr>
-            <w:tcW w:w="3213" w:type="dxa"/>
-            <w:tcBorders>
-              <w:top w:val="single" w:sz="1" w:space="0" w:color="2E4057"/>
-              <w:left w:val="single" w:sz="1" w:space="0" w:color="2E4057"/>
-              <w:bottom w:val="single" w:sz="1" w:space="0" w:color="2E4057"/>
-              <w:right w:val="single" w:sz="1" w:space="0" w:color="2E4057"/>
-            </w:tcBorders>
-            <w:shd w:val="clear" w:color="auto" w:fill="2E4057"/>
-            <w:tcMar>
-              <w:top w:w="100" w:type="dxa"/>
-              <w:left w:w="140" w:type="dxa"/>
-              <w:bottom w:w="100" w:type="dxa"/>
-              <w:right w:w="140" w:type="dxa"/>
-            </w:tcMar>
-          </w:tcPr>
-          <w:p>
-            <w:pPr>
+            <w:tcW w:w="2703" w:type="dxa"/>
+          </w:tcPr>
+          <w:p>
+            <w:pPr>
+              <w:spacing w:before="80" w:after="120"/>
               <w:jc w:val="center"/>
               <w:rPr>
                 <w:rFonts w:ascii="Palatino Linotype" w:hAnsi="Palatino Linotype"/>
@@ -2863,23 +3142,11 @@
         </w:tc>
         <w:tc>
           <w:tcPr>
-            <w:tcW w:w="3213" w:type="dxa"/>
-            <w:tcBorders>
-              <w:top w:val="single" w:sz="1" w:space="0" w:color="2E4057"/>
-              <w:left w:val="single" w:sz="1" w:space="0" w:color="2E4057"/>
-              <w:bottom w:val="single" w:sz="1" w:space="0" w:color="2E4057"/>
-              <w:right w:val="single" w:sz="1" w:space="0" w:color="2E4057"/>
-            </w:tcBorders>
-            <w:shd w:val="clear" w:color="auto" w:fill="2E4057"/>
-            <w:tcMar>
-              <w:top w:w="100" w:type="dxa"/>
-              <w:left w:w="140" w:type="dxa"/>
-              <w:bottom w:w="100" w:type="dxa"/>
-              <w:right w:w="140" w:type="dxa"/>
-            </w:tcMar>
-          </w:tcPr>
-          <w:p>
-            <w:pPr>
+            <w:tcW w:w="2510" w:type="dxa"/>
+          </w:tcPr>
+          <w:p>
+            <w:pPr>
+              <w:spacing w:before="80" w:after="120"/>
               <w:jc w:val="center"/>
               <w:rPr>
                 <w:rFonts w:ascii="Palatino Linotype" w:hAnsi="Palatino Linotype"/>
@@ -2905,23 +3172,11 @@
       <w:tr>
         <w:tc>
           <w:tcPr>
-            <w:tcW w:w="600" w:type="dxa"/>
-            <w:tcBorders>
-              <w:top w:val="single" w:sz="1" w:space="0" w:color="AAAAAA"/>
-              <w:left w:val="single" w:sz="1" w:space="0" w:color="AAAAAA"/>
-              <w:bottom w:val="single" w:sz="1" w:space="0" w:color="AAAAAA"/>
-              <w:right w:val="single" w:sz="1" w:space="0" w:color="AAAAAA"/>
-            </w:tcBorders>
-            <w:shd w:val="clear" w:color="auto" w:fill="F8F9FA"/>
-            <w:tcMar>
-              <w:top w:w="80" w:type="dxa"/>
-              <w:left w:w="120" w:type="dxa"/>
-              <w:bottom w:w="80" w:type="dxa"/>
-              <w:right w:w="120" w:type="dxa"/>
-            </w:tcMar>
-          </w:tcPr>
-          <w:p>
-            <w:pPr>
+            <w:tcW w:w="2156" w:type="dxa"/>
+          </w:tcPr>
+          <w:p>
+            <w:pPr>
+              <w:spacing w:before="80" w:after="120"/>
               <w:jc w:val="center"/>
               <w:rPr>
                 <w:rFonts w:ascii="Palatino Linotype" w:hAnsi="Palatino Linotype"/>
@@ -2943,23 +3198,11 @@
         </w:tc>
         <w:tc>
           <w:tcPr>
-            <w:tcW w:w="2000" w:type="dxa"/>
-            <w:tcBorders>
-              <w:top w:val="single" w:sz="1" w:space="0" w:color="AAAAAA"/>
-              <w:left w:val="single" w:sz="1" w:space="0" w:color="AAAAAA"/>
-              <w:bottom w:val="single" w:sz="1" w:space="0" w:color="AAAAAA"/>
-              <w:right w:val="single" w:sz="1" w:space="0" w:color="AAAAAA"/>
-            </w:tcBorders>
-            <w:shd w:val="clear" w:color="auto" w:fill="F8F9FA"/>
-            <w:tcMar>
-              <w:top w:w="80" w:type="dxa"/>
-              <w:left w:w="120" w:type="dxa"/>
-              <w:bottom w:w="80" w:type="dxa"/>
-              <w:right w:w="120" w:type="dxa"/>
-            </w:tcMar>
-          </w:tcPr>
-          <w:p>
-            <w:pPr>
+            <w:tcW w:w="2167" w:type="dxa"/>
+          </w:tcPr>
+          <w:p>
+            <w:pPr>
+              <w:spacing w:before="80" w:after="120"/>
               <w:jc w:val="center"/>
               <w:rPr>
                 <w:rFonts w:ascii="Palatino Linotype" w:hAnsi="Palatino Linotype"/>
@@ -2981,61 +3224,57 @@
         </w:tc>
         <w:tc>
           <w:tcPr>
-            <w:tcW w:w="3213" w:type="dxa"/>
-            <w:tcBorders>
-              <w:top w:val="single" w:sz="1" w:space="0" w:color="AAAAAA"/>
-              <w:left w:val="single" w:sz="1" w:space="0" w:color="AAAAAA"/>
-              <w:bottom w:val="single" w:sz="1" w:space="0" w:color="AAAAAA"/>
-              <w:right w:val="single" w:sz="1" w:space="0" w:color="AAAAAA"/>
-            </w:tcBorders>
-            <w:shd w:val="clear" w:color="auto" w:fill="F8F9FA"/>
-            <w:tcMar>
-              <w:top w:w="80" w:type="dxa"/>
-              <w:left w:w="120" w:type="dxa"/>
-              <w:bottom w:w="80" w:type="dxa"/>
-              <w:right w:w="120" w:type="dxa"/>
-            </w:tcMar>
-          </w:tcPr>
-          <w:p>
-            <w:pPr>
-              <w:jc w:val="center"/>
-              <w:rPr>
-                <w:rFonts w:ascii="Palatino Linotype" w:hAnsi="Palatino Linotype"/>
-                <w:color w:val="000000" w:themeColor="text1"/>
-                <w:sz w:val="24"/>
-                <w:szCs w:val="24"/>
-              </w:rPr>
-            </w:pPr>
-            <w:r>
-              <w:rPr>
-                <w:rFonts w:ascii="Palatino Linotype" w:hAnsi="Palatino Linotype"/>
-                <w:color w:val="000000" w:themeColor="text1"/>
-                <w:sz w:val="24"/>
-                <w:szCs w:val="24"/>
-              </w:rPr>
-              <w:t>Sends a challenge request to Vault: {request_type}</w:t>
-            </w:r>
-          </w:p>
-        </w:tc>
-        <w:tc>
-          <w:tcPr>
-            <w:tcW w:w="3213" w:type="dxa"/>
-            <w:tcBorders>
-              <w:top w:val="single" w:sz="1" w:space="0" w:color="AAAAAA"/>
-              <w:left w:val="single" w:sz="1" w:space="0" w:color="AAAAAA"/>
-              <w:bottom w:val="single" w:sz="1" w:space="0" w:color="AAAAAA"/>
-              <w:right w:val="single" w:sz="1" w:space="0" w:color="AAAAAA"/>
-            </w:tcBorders>
-            <w:shd w:val="clear" w:color="auto" w:fill="F8F9FA"/>
-            <w:tcMar>
-              <w:top w:w="80" w:type="dxa"/>
-              <w:left w:w="120" w:type="dxa"/>
-              <w:bottom w:w="80" w:type="dxa"/>
-              <w:right w:w="120" w:type="dxa"/>
-            </w:tcMar>
-          </w:tcPr>
-          <w:p>
-            <w:pPr>
+            <w:tcW w:w="2703" w:type="dxa"/>
+          </w:tcPr>
+          <w:p>
+            <w:pPr>
+              <w:spacing w:before="80" w:after="120"/>
+              <w:jc w:val="center"/>
+              <w:rPr>
+                <w:rFonts w:ascii="Palatino Linotype" w:hAnsi="Palatino Linotype"/>
+                <w:color w:val="000000" w:themeColor="text1"/>
+                <w:sz w:val="24"/>
+                <w:szCs w:val="24"/>
+              </w:rPr>
+            </w:pPr>
+            <w:r>
+              <w:rPr>
+                <w:rFonts w:ascii="Palatino Linotype" w:hAnsi="Palatino Linotype"/>
+                <w:color w:val="000000" w:themeColor="text1"/>
+                <w:sz w:val="24"/>
+                <w:szCs w:val="24"/>
+              </w:rPr>
+              <w:t>Sends a challenge request to Vault: {</w:t>
+            </w:r>
+            <w:proofErr w:type="spellStart"/>
+            <w:r>
+              <w:rPr>
+                <w:rFonts w:ascii="Palatino Linotype" w:hAnsi="Palatino Linotype"/>
+                <w:color w:val="000000" w:themeColor="text1"/>
+                <w:sz w:val="24"/>
+                <w:szCs w:val="24"/>
+              </w:rPr>
+              <w:t>request_type</w:t>
+            </w:r>
+            <w:proofErr w:type="spellEnd"/>
+            <w:r>
+              <w:rPr>
+                <w:rFonts w:ascii="Palatino Linotype" w:hAnsi="Palatino Linotype"/>
+                <w:color w:val="000000" w:themeColor="text1"/>
+                <w:sz w:val="24"/>
+                <w:szCs w:val="24"/>
+              </w:rPr>
+              <w:t>}</w:t>
+            </w:r>
+          </w:p>
+        </w:tc>
+        <w:tc>
+          <w:tcPr>
+            <w:tcW w:w="2510" w:type="dxa"/>
+          </w:tcPr>
+          <w:p>
+            <w:pPr>
+              <w:spacing w:before="80" w:after="120"/>
               <w:jc w:val="center"/>
               <w:rPr>
                 <w:rFonts w:ascii="Palatino Linotype" w:hAnsi="Palatino Linotype"/>
@@ -3059,23 +3298,11 @@
       <w:tr>
         <w:tc>
           <w:tcPr>
-            <w:tcW w:w="600" w:type="dxa"/>
-            <w:tcBorders>
-              <w:top w:val="single" w:sz="1" w:space="0" w:color="AAAAAA"/>
-              <w:left w:val="single" w:sz="1" w:space="0" w:color="AAAAAA"/>
-              <w:bottom w:val="single" w:sz="1" w:space="0" w:color="AAAAAA"/>
-              <w:right w:val="single" w:sz="1" w:space="0" w:color="AAAAAA"/>
-            </w:tcBorders>
-            <w:shd w:val="clear" w:color="auto" w:fill="FFFFFF"/>
-            <w:tcMar>
-              <w:top w:w="80" w:type="dxa"/>
-              <w:left w:w="120" w:type="dxa"/>
-              <w:bottom w:w="80" w:type="dxa"/>
-              <w:right w:w="120" w:type="dxa"/>
-            </w:tcMar>
-          </w:tcPr>
-          <w:p>
-            <w:pPr>
+            <w:tcW w:w="2156" w:type="dxa"/>
+          </w:tcPr>
+          <w:p>
+            <w:pPr>
+              <w:spacing w:before="80" w:after="120"/>
               <w:jc w:val="center"/>
               <w:rPr>
                 <w:rFonts w:ascii="Palatino Linotype" w:hAnsi="Palatino Linotype"/>
@@ -3097,23 +3324,11 @@
         </w:tc>
         <w:tc>
           <w:tcPr>
-            <w:tcW w:w="2000" w:type="dxa"/>
-            <w:tcBorders>
-              <w:top w:val="single" w:sz="1" w:space="0" w:color="AAAAAA"/>
-              <w:left w:val="single" w:sz="1" w:space="0" w:color="AAAAAA"/>
-              <w:bottom w:val="single" w:sz="1" w:space="0" w:color="AAAAAA"/>
-              <w:right w:val="single" w:sz="1" w:space="0" w:color="AAAAAA"/>
-            </w:tcBorders>
-            <w:shd w:val="clear" w:color="auto" w:fill="FFFFFF"/>
-            <w:tcMar>
-              <w:top w:w="80" w:type="dxa"/>
-              <w:left w:w="120" w:type="dxa"/>
-              <w:bottom w:w="80" w:type="dxa"/>
-              <w:right w:w="120" w:type="dxa"/>
-            </w:tcMar>
-          </w:tcPr>
-          <w:p>
-            <w:pPr>
+            <w:tcW w:w="2167" w:type="dxa"/>
+          </w:tcPr>
+          <w:p>
+            <w:pPr>
+              <w:spacing w:before="80" w:after="120"/>
               <w:jc w:val="center"/>
               <w:rPr>
                 <w:rFonts w:ascii="Palatino Linotype" w:hAnsi="Palatino Linotype"/>
@@ -3135,23 +3350,11 @@
         </w:tc>
         <w:tc>
           <w:tcPr>
-            <w:tcW w:w="3213" w:type="dxa"/>
-            <w:tcBorders>
-              <w:top w:val="single" w:sz="1" w:space="0" w:color="AAAAAA"/>
-              <w:left w:val="single" w:sz="1" w:space="0" w:color="AAAAAA"/>
-              <w:bottom w:val="single" w:sz="1" w:space="0" w:color="AAAAAA"/>
-              <w:right w:val="single" w:sz="1" w:space="0" w:color="AAAAAA"/>
-            </w:tcBorders>
-            <w:shd w:val="clear" w:color="auto" w:fill="FFFFFF"/>
-            <w:tcMar>
-              <w:top w:w="80" w:type="dxa"/>
-              <w:left w:w="120" w:type="dxa"/>
-              <w:bottom w:w="80" w:type="dxa"/>
-              <w:right w:w="120" w:type="dxa"/>
-            </w:tcMar>
-          </w:tcPr>
-          <w:p>
-            <w:pPr>
+            <w:tcW w:w="2703" w:type="dxa"/>
+          </w:tcPr>
+          <w:p>
+            <w:pPr>
+              <w:spacing w:before="80" w:after="120"/>
               <w:jc w:val="center"/>
               <w:rPr>
                 <w:rFonts w:ascii="Palatino Linotype" w:hAnsi="Palatino Linotype"/>
@@ -3173,39 +3376,27 @@
         </w:tc>
         <w:tc>
           <w:tcPr>
-            <w:tcW w:w="3213" w:type="dxa"/>
-            <w:tcBorders>
-              <w:top w:val="single" w:sz="1" w:space="0" w:color="AAAAAA"/>
-              <w:left w:val="single" w:sz="1" w:space="0" w:color="AAAAAA"/>
-              <w:bottom w:val="single" w:sz="1" w:space="0" w:color="AAAAAA"/>
-              <w:right w:val="single" w:sz="1" w:space="0" w:color="AAAAAA"/>
-            </w:tcBorders>
-            <w:shd w:val="clear" w:color="auto" w:fill="FFFFFF"/>
-            <w:tcMar>
-              <w:top w:w="80" w:type="dxa"/>
-              <w:left w:w="120" w:type="dxa"/>
-              <w:bottom w:w="80" w:type="dxa"/>
-              <w:right w:w="120" w:type="dxa"/>
-            </w:tcMar>
-          </w:tcPr>
-          <w:p>
-            <w:pPr>
-              <w:jc w:val="center"/>
-              <w:rPr>
-                <w:rFonts w:ascii="Palatino Linotype" w:hAnsi="Palatino Linotype"/>
-                <w:color w:val="000000" w:themeColor="text1"/>
-                <w:sz w:val="24"/>
-                <w:szCs w:val="24"/>
-              </w:rPr>
-            </w:pPr>
-            <w:r>
-              <w:rPr>
-                <w:rFonts w:ascii="Palatino Linotype" w:hAnsi="Palatino Linotype"/>
-                <w:color w:val="000000" w:themeColor="text1"/>
-                <w:sz w:val="24"/>
-                <w:szCs w:val="24"/>
-              </w:rPr>
-              <w:t>N is single-use; stored until verified or expired</w:t>
+            <w:tcW w:w="2510" w:type="dxa"/>
+          </w:tcPr>
+          <w:p>
+            <w:pPr>
+              <w:spacing w:before="80" w:after="120"/>
+              <w:jc w:val="center"/>
+              <w:rPr>
+                <w:rFonts w:ascii="Palatino Linotype" w:hAnsi="Palatino Linotype"/>
+                <w:color w:val="000000" w:themeColor="text1"/>
+                <w:sz w:val="24"/>
+                <w:szCs w:val="24"/>
+              </w:rPr>
+            </w:pPr>
+            <w:r>
+              <w:rPr>
+                <w:rFonts w:ascii="Palatino Linotype" w:hAnsi="Palatino Linotype"/>
+                <w:color w:val="000000" w:themeColor="text1"/>
+                <w:sz w:val="24"/>
+                <w:szCs w:val="24"/>
+              </w:rPr>
+              <w:t>N is single use; stored until verified or expired</w:t>
             </w:r>
           </w:p>
         </w:tc>
@@ -3213,23 +3404,11 @@
       <w:tr>
         <w:tc>
           <w:tcPr>
-            <w:tcW w:w="600" w:type="dxa"/>
-            <w:tcBorders>
-              <w:top w:val="single" w:sz="1" w:space="0" w:color="AAAAAA"/>
-              <w:left w:val="single" w:sz="1" w:space="0" w:color="AAAAAA"/>
-              <w:bottom w:val="single" w:sz="1" w:space="0" w:color="AAAAAA"/>
-              <w:right w:val="single" w:sz="1" w:space="0" w:color="AAAAAA"/>
-            </w:tcBorders>
-            <w:shd w:val="clear" w:color="auto" w:fill="F8F9FA"/>
-            <w:tcMar>
-              <w:top w:w="80" w:type="dxa"/>
-              <w:left w:w="120" w:type="dxa"/>
-              <w:bottom w:w="80" w:type="dxa"/>
-              <w:right w:w="120" w:type="dxa"/>
-            </w:tcMar>
-          </w:tcPr>
-          <w:p>
-            <w:pPr>
+            <w:tcW w:w="2156" w:type="dxa"/>
+          </w:tcPr>
+          <w:p>
+            <w:pPr>
+              <w:spacing w:before="80" w:after="120"/>
               <w:jc w:val="center"/>
               <w:rPr>
                 <w:rFonts w:ascii="Palatino Linotype" w:hAnsi="Palatino Linotype"/>
@@ -3252,23 +3431,11 @@
         </w:tc>
         <w:tc>
           <w:tcPr>
-            <w:tcW w:w="2000" w:type="dxa"/>
-            <w:tcBorders>
-              <w:top w:val="single" w:sz="1" w:space="0" w:color="AAAAAA"/>
-              <w:left w:val="single" w:sz="1" w:space="0" w:color="AAAAAA"/>
-              <w:bottom w:val="single" w:sz="1" w:space="0" w:color="AAAAAA"/>
-              <w:right w:val="single" w:sz="1" w:space="0" w:color="AAAAAA"/>
-            </w:tcBorders>
-            <w:shd w:val="clear" w:color="auto" w:fill="F8F9FA"/>
-            <w:tcMar>
-              <w:top w:w="80" w:type="dxa"/>
-              <w:left w:w="120" w:type="dxa"/>
-              <w:bottom w:w="80" w:type="dxa"/>
-              <w:right w:w="120" w:type="dxa"/>
-            </w:tcMar>
-          </w:tcPr>
-          <w:p>
-            <w:pPr>
+            <w:tcW w:w="2167" w:type="dxa"/>
+          </w:tcPr>
+          <w:p>
+            <w:pPr>
+              <w:spacing w:before="80" w:after="120"/>
               <w:jc w:val="center"/>
               <w:rPr>
                 <w:rFonts w:ascii="Palatino Linotype" w:hAnsi="Palatino Linotype"/>
@@ -3290,61 +3457,57 @@
         </w:tc>
         <w:tc>
           <w:tcPr>
-            <w:tcW w:w="3213" w:type="dxa"/>
-            <w:tcBorders>
-              <w:top w:val="single" w:sz="1" w:space="0" w:color="AAAAAA"/>
-              <w:left w:val="single" w:sz="1" w:space="0" w:color="AAAAAA"/>
-              <w:bottom w:val="single" w:sz="1" w:space="0" w:color="AAAAAA"/>
-              <w:right w:val="single" w:sz="1" w:space="0" w:color="AAAAAA"/>
-            </w:tcBorders>
-            <w:shd w:val="clear" w:color="auto" w:fill="F8F9FA"/>
-            <w:tcMar>
-              <w:top w:w="80" w:type="dxa"/>
-              <w:left w:w="120" w:type="dxa"/>
-              <w:bottom w:w="80" w:type="dxa"/>
-              <w:right w:w="120" w:type="dxa"/>
-            </w:tcMar>
-          </w:tcPr>
-          <w:p>
-            <w:pPr>
-              <w:jc w:val="center"/>
-              <w:rPr>
-                <w:rFonts w:ascii="Palatino Linotype" w:hAnsi="Palatino Linotype"/>
-                <w:color w:val="000000" w:themeColor="text1"/>
-                <w:sz w:val="24"/>
-                <w:szCs w:val="24"/>
-              </w:rPr>
-            </w:pPr>
-            <w:r>
-              <w:rPr>
-                <w:rFonts w:ascii="Palatino Linotype" w:hAnsi="Palatino Linotype"/>
-                <w:color w:val="000000" w:themeColor="text1"/>
-                <w:sz w:val="24"/>
-                <w:szCs w:val="24"/>
-              </w:rPr>
-              <w:t>Records current timestamp T. Computes: token = HMAC-SHA256(K, N || T || request_type)</w:t>
-            </w:r>
-          </w:p>
-        </w:tc>
-        <w:tc>
-          <w:tcPr>
-            <w:tcW w:w="3213" w:type="dxa"/>
-            <w:tcBorders>
-              <w:top w:val="single" w:sz="1" w:space="0" w:color="AAAAAA"/>
-              <w:left w:val="single" w:sz="1" w:space="0" w:color="AAAAAA"/>
-              <w:bottom w:val="single" w:sz="1" w:space="0" w:color="AAAAAA"/>
-              <w:right w:val="single" w:sz="1" w:space="0" w:color="AAAAAA"/>
-            </w:tcBorders>
-            <w:shd w:val="clear" w:color="auto" w:fill="F8F9FA"/>
-            <w:tcMar>
-              <w:top w:w="80" w:type="dxa"/>
-              <w:left w:w="120" w:type="dxa"/>
-              <w:bottom w:w="80" w:type="dxa"/>
-              <w:right w:w="120" w:type="dxa"/>
-            </w:tcMar>
-          </w:tcPr>
-          <w:p>
-            <w:pPr>
+            <w:tcW w:w="2703" w:type="dxa"/>
+          </w:tcPr>
+          <w:p>
+            <w:pPr>
+              <w:spacing w:before="80" w:after="120"/>
+              <w:jc w:val="center"/>
+              <w:rPr>
+                <w:rFonts w:ascii="Palatino Linotype" w:hAnsi="Palatino Linotype"/>
+                <w:color w:val="000000" w:themeColor="text1"/>
+                <w:sz w:val="24"/>
+                <w:szCs w:val="24"/>
+              </w:rPr>
+            </w:pPr>
+            <w:r>
+              <w:rPr>
+                <w:rFonts w:ascii="Palatino Linotype" w:hAnsi="Palatino Linotype"/>
+                <w:color w:val="000000" w:themeColor="text1"/>
+                <w:sz w:val="24"/>
+                <w:szCs w:val="24"/>
+              </w:rPr>
+              <w:t xml:space="preserve">Records current timestamp T. Computes: token = HMAC-SHA256(K, N || T || </w:t>
+            </w:r>
+            <w:proofErr w:type="spellStart"/>
+            <w:r>
+              <w:rPr>
+                <w:rFonts w:ascii="Palatino Linotype" w:hAnsi="Palatino Linotype"/>
+                <w:color w:val="000000" w:themeColor="text1"/>
+                <w:sz w:val="24"/>
+                <w:szCs w:val="24"/>
+              </w:rPr>
+              <w:t>request_type</w:t>
+            </w:r>
+            <w:proofErr w:type="spellEnd"/>
+            <w:r>
+              <w:rPr>
+                <w:rFonts w:ascii="Palatino Linotype" w:hAnsi="Palatino Linotype"/>
+                <w:color w:val="000000" w:themeColor="text1"/>
+                <w:sz w:val="24"/>
+                <w:szCs w:val="24"/>
+              </w:rPr>
+              <w:t>)</w:t>
+            </w:r>
+          </w:p>
+        </w:tc>
+        <w:tc>
+          <w:tcPr>
+            <w:tcW w:w="2510" w:type="dxa"/>
+          </w:tcPr>
+          <w:p>
+            <w:pPr>
+              <w:spacing w:before="80" w:after="120"/>
               <w:jc w:val="center"/>
               <w:rPr>
                 <w:rFonts w:ascii="Palatino Linotype" w:hAnsi="Palatino Linotype"/>
@@ -3368,23 +3531,11 @@
       <w:tr>
         <w:tc>
           <w:tcPr>
-            <w:tcW w:w="600" w:type="dxa"/>
-            <w:tcBorders>
-              <w:top w:val="single" w:sz="1" w:space="0" w:color="AAAAAA"/>
-              <w:left w:val="single" w:sz="1" w:space="0" w:color="AAAAAA"/>
-              <w:bottom w:val="single" w:sz="1" w:space="0" w:color="AAAAAA"/>
-              <w:right w:val="single" w:sz="1" w:space="0" w:color="AAAAAA"/>
-            </w:tcBorders>
-            <w:shd w:val="clear" w:color="auto" w:fill="FFFFFF"/>
-            <w:tcMar>
-              <w:top w:w="80" w:type="dxa"/>
-              <w:left w:w="120" w:type="dxa"/>
-              <w:bottom w:w="80" w:type="dxa"/>
-              <w:right w:w="120" w:type="dxa"/>
-            </w:tcMar>
-          </w:tcPr>
-          <w:p>
-            <w:pPr>
+            <w:tcW w:w="2156" w:type="dxa"/>
+          </w:tcPr>
+          <w:p>
+            <w:pPr>
+              <w:spacing w:before="80" w:after="120"/>
               <w:jc w:val="center"/>
               <w:rPr>
                 <w:rFonts w:ascii="Palatino Linotype" w:hAnsi="Palatino Linotype"/>
@@ -3406,23 +3557,11 @@
         </w:tc>
         <w:tc>
           <w:tcPr>
-            <w:tcW w:w="2000" w:type="dxa"/>
-            <w:tcBorders>
-              <w:top w:val="single" w:sz="1" w:space="0" w:color="AAAAAA"/>
-              <w:left w:val="single" w:sz="1" w:space="0" w:color="AAAAAA"/>
-              <w:bottom w:val="single" w:sz="1" w:space="0" w:color="AAAAAA"/>
-              <w:right w:val="single" w:sz="1" w:space="0" w:color="AAAAAA"/>
-            </w:tcBorders>
-            <w:shd w:val="clear" w:color="auto" w:fill="FFFFFF"/>
-            <w:tcMar>
-              <w:top w:w="80" w:type="dxa"/>
-              <w:left w:w="120" w:type="dxa"/>
-              <w:bottom w:w="80" w:type="dxa"/>
-              <w:right w:w="120" w:type="dxa"/>
-            </w:tcMar>
-          </w:tcPr>
-          <w:p>
-            <w:pPr>
+            <w:tcW w:w="2167" w:type="dxa"/>
+          </w:tcPr>
+          <w:p>
+            <w:pPr>
+              <w:spacing w:before="80" w:after="120"/>
               <w:jc w:val="center"/>
               <w:rPr>
                 <w:rFonts w:ascii="Palatino Linotype" w:hAnsi="Palatino Linotype"/>
@@ -3444,61 +3583,57 @@
         </w:tc>
         <w:tc>
           <w:tcPr>
-            <w:tcW w:w="3213" w:type="dxa"/>
-            <w:tcBorders>
-              <w:top w:val="single" w:sz="1" w:space="0" w:color="AAAAAA"/>
-              <w:left w:val="single" w:sz="1" w:space="0" w:color="AAAAAA"/>
-              <w:bottom w:val="single" w:sz="1" w:space="0" w:color="AAAAAA"/>
-              <w:right w:val="single" w:sz="1" w:space="0" w:color="AAAAAA"/>
-            </w:tcBorders>
-            <w:shd w:val="clear" w:color="auto" w:fill="FFFFFF"/>
-            <w:tcMar>
-              <w:top w:w="80" w:type="dxa"/>
-              <w:left w:w="120" w:type="dxa"/>
-              <w:bottom w:w="80" w:type="dxa"/>
-              <w:right w:w="120" w:type="dxa"/>
-            </w:tcMar>
-          </w:tcPr>
-          <w:p>
-            <w:pPr>
-              <w:jc w:val="center"/>
-              <w:rPr>
-                <w:rFonts w:ascii="Palatino Linotype" w:hAnsi="Palatino Linotype"/>
-                <w:color w:val="000000" w:themeColor="text1"/>
-                <w:sz w:val="24"/>
-                <w:szCs w:val="24"/>
-              </w:rPr>
-            </w:pPr>
-            <w:r>
-              <w:rPr>
-                <w:rFonts w:ascii="Palatino Linotype" w:hAnsi="Palatino Linotype"/>
-                <w:color w:val="000000" w:themeColor="text1"/>
-                <w:sz w:val="24"/>
-                <w:szCs w:val="24"/>
-              </w:rPr>
-              <w:t>Sends {N, T, request_type, token} to Vault</w:t>
-            </w:r>
-          </w:p>
-        </w:tc>
-        <w:tc>
-          <w:tcPr>
-            <w:tcW w:w="3213" w:type="dxa"/>
-            <w:tcBorders>
-              <w:top w:val="single" w:sz="1" w:space="0" w:color="AAAAAA"/>
-              <w:left w:val="single" w:sz="1" w:space="0" w:color="AAAAAA"/>
-              <w:bottom w:val="single" w:sz="1" w:space="0" w:color="AAAAAA"/>
-              <w:right w:val="single" w:sz="1" w:space="0" w:color="AAAAAA"/>
-            </w:tcBorders>
-            <w:shd w:val="clear" w:color="auto" w:fill="FFFFFF"/>
-            <w:tcMar>
-              <w:top w:w="80" w:type="dxa"/>
-              <w:left w:w="120" w:type="dxa"/>
-              <w:bottom w:w="80" w:type="dxa"/>
-              <w:right w:w="120" w:type="dxa"/>
-            </w:tcMar>
-          </w:tcPr>
-          <w:p>
-            <w:pPr>
+            <w:tcW w:w="2703" w:type="dxa"/>
+          </w:tcPr>
+          <w:p>
+            <w:pPr>
+              <w:spacing w:before="80" w:after="120"/>
+              <w:jc w:val="center"/>
+              <w:rPr>
+                <w:rFonts w:ascii="Palatino Linotype" w:hAnsi="Palatino Linotype"/>
+                <w:color w:val="000000" w:themeColor="text1"/>
+                <w:sz w:val="24"/>
+                <w:szCs w:val="24"/>
+              </w:rPr>
+            </w:pPr>
+            <w:r>
+              <w:rPr>
+                <w:rFonts w:ascii="Palatino Linotype" w:hAnsi="Palatino Linotype"/>
+                <w:color w:val="000000" w:themeColor="text1"/>
+                <w:sz w:val="24"/>
+                <w:szCs w:val="24"/>
+              </w:rPr>
+              <w:t xml:space="preserve">Sends {N, T, </w:t>
+            </w:r>
+            <w:proofErr w:type="spellStart"/>
+            <w:r>
+              <w:rPr>
+                <w:rFonts w:ascii="Palatino Linotype" w:hAnsi="Palatino Linotype"/>
+                <w:color w:val="000000" w:themeColor="text1"/>
+                <w:sz w:val="24"/>
+                <w:szCs w:val="24"/>
+              </w:rPr>
+              <w:t>request_type</w:t>
+            </w:r>
+            <w:proofErr w:type="spellEnd"/>
+            <w:r>
+              <w:rPr>
+                <w:rFonts w:ascii="Palatino Linotype" w:hAnsi="Palatino Linotype"/>
+                <w:color w:val="000000" w:themeColor="text1"/>
+                <w:sz w:val="24"/>
+                <w:szCs w:val="24"/>
+              </w:rPr>
+              <w:t>, token} to Vault</w:t>
+            </w:r>
+          </w:p>
+        </w:tc>
+        <w:tc>
+          <w:tcPr>
+            <w:tcW w:w="2510" w:type="dxa"/>
+          </w:tcPr>
+          <w:p>
+            <w:pPr>
+              <w:spacing w:before="80" w:after="120"/>
               <w:jc w:val="center"/>
               <w:rPr>
                 <w:rFonts w:ascii="Palatino Linotype" w:hAnsi="Palatino Linotype"/>
@@ -3522,23 +3657,11 @@
       <w:tr>
         <w:tc>
           <w:tcPr>
-            <w:tcW w:w="600" w:type="dxa"/>
-            <w:tcBorders>
-              <w:top w:val="single" w:sz="1" w:space="0" w:color="AAAAAA"/>
-              <w:left w:val="single" w:sz="1" w:space="0" w:color="AAAAAA"/>
-              <w:bottom w:val="single" w:sz="1" w:space="0" w:color="AAAAAA"/>
-              <w:right w:val="single" w:sz="1" w:space="0" w:color="AAAAAA"/>
-            </w:tcBorders>
-            <w:shd w:val="clear" w:color="auto" w:fill="F8F9FA"/>
-            <w:tcMar>
-              <w:top w:w="80" w:type="dxa"/>
-              <w:left w:w="120" w:type="dxa"/>
-              <w:bottom w:w="80" w:type="dxa"/>
-              <w:right w:w="120" w:type="dxa"/>
-            </w:tcMar>
-          </w:tcPr>
-          <w:p>
-            <w:pPr>
+            <w:tcW w:w="2156" w:type="dxa"/>
+          </w:tcPr>
+          <w:p>
+            <w:pPr>
+              <w:spacing w:before="80" w:after="120"/>
               <w:jc w:val="center"/>
               <w:rPr>
                 <w:rFonts w:ascii="Palatino Linotype" w:hAnsi="Palatino Linotype"/>
@@ -3560,23 +3683,11 @@
         </w:tc>
         <w:tc>
           <w:tcPr>
-            <w:tcW w:w="2000" w:type="dxa"/>
-            <w:tcBorders>
-              <w:top w:val="single" w:sz="1" w:space="0" w:color="AAAAAA"/>
-              <w:left w:val="single" w:sz="1" w:space="0" w:color="AAAAAA"/>
-              <w:bottom w:val="single" w:sz="1" w:space="0" w:color="AAAAAA"/>
-              <w:right w:val="single" w:sz="1" w:space="0" w:color="AAAAAA"/>
-            </w:tcBorders>
-            <w:shd w:val="clear" w:color="auto" w:fill="F8F9FA"/>
-            <w:tcMar>
-              <w:top w:w="80" w:type="dxa"/>
-              <w:left w:w="120" w:type="dxa"/>
-              <w:bottom w:w="80" w:type="dxa"/>
-              <w:right w:w="120" w:type="dxa"/>
-            </w:tcMar>
-          </w:tcPr>
-          <w:p>
-            <w:pPr>
+            <w:tcW w:w="2167" w:type="dxa"/>
+          </w:tcPr>
+          <w:p>
+            <w:pPr>
+              <w:spacing w:before="80" w:after="120"/>
               <w:jc w:val="center"/>
               <w:rPr>
                 <w:rFonts w:ascii="Palatino Linotype" w:hAnsi="Palatino Linotype"/>
@@ -3598,61 +3709,97 @@
         </w:tc>
         <w:tc>
           <w:tcPr>
-            <w:tcW w:w="3213" w:type="dxa"/>
-            <w:tcBorders>
-              <w:top w:val="single" w:sz="1" w:space="0" w:color="AAAAAA"/>
-              <w:left w:val="single" w:sz="1" w:space="0" w:color="AAAAAA"/>
-              <w:bottom w:val="single" w:sz="1" w:space="0" w:color="AAAAAA"/>
-              <w:right w:val="single" w:sz="1" w:space="0" w:color="AAAAAA"/>
-            </w:tcBorders>
-            <w:shd w:val="clear" w:color="auto" w:fill="F8F9FA"/>
-            <w:tcMar>
-              <w:top w:w="80" w:type="dxa"/>
-              <w:left w:w="120" w:type="dxa"/>
-              <w:bottom w:w="80" w:type="dxa"/>
-              <w:right w:w="120" w:type="dxa"/>
-            </w:tcMar>
-          </w:tcPr>
-          <w:p>
-            <w:pPr>
-              <w:jc w:val="center"/>
-              <w:rPr>
-                <w:rFonts w:ascii="Palatino Linotype" w:hAnsi="Palatino Linotype"/>
-                <w:color w:val="000000" w:themeColor="text1"/>
-                <w:sz w:val="24"/>
-                <w:szCs w:val="24"/>
-              </w:rPr>
-            </w:pPr>
-            <w:r>
-              <w:rPr>
-                <w:rFonts w:ascii="Palatino Linotype" w:hAnsi="Palatino Linotype"/>
-                <w:color w:val="000000" w:themeColor="text1"/>
-                <w:sz w:val="24"/>
-                <w:szCs w:val="24"/>
-              </w:rPr>
-              <w:t>(a) Verifies N was issued by this Vault. (b) Deletes N (one-time use). (c) Checks |now - T| &lt;= 30s. (d) Recomputes expected_token = HMAC-SHA256(K, N || T || request_type). (e) Uses hmac.compare_digest() for constant-time comparison.</w:t>
-            </w:r>
-          </w:p>
-        </w:tc>
-        <w:tc>
-          <w:tcPr>
-            <w:tcW w:w="3213" w:type="dxa"/>
-            <w:tcBorders>
-              <w:top w:val="single" w:sz="1" w:space="0" w:color="AAAAAA"/>
-              <w:left w:val="single" w:sz="1" w:space="0" w:color="AAAAAA"/>
-              <w:bottom w:val="single" w:sz="1" w:space="0" w:color="AAAAAA"/>
-              <w:right w:val="single" w:sz="1" w:space="0" w:color="AAAAAA"/>
-            </w:tcBorders>
-            <w:shd w:val="clear" w:color="auto" w:fill="F8F9FA"/>
-            <w:tcMar>
-              <w:top w:w="80" w:type="dxa"/>
-              <w:left w:w="120" w:type="dxa"/>
-              <w:bottom w:w="80" w:type="dxa"/>
-              <w:right w:w="120" w:type="dxa"/>
-            </w:tcMar>
-          </w:tcPr>
-          <w:p>
-            <w:pPr>
+            <w:tcW w:w="2703" w:type="dxa"/>
+          </w:tcPr>
+          <w:p>
+            <w:pPr>
+              <w:spacing w:before="80" w:after="120"/>
+              <w:jc w:val="center"/>
+              <w:rPr>
+                <w:rFonts w:ascii="Palatino Linotype" w:hAnsi="Palatino Linotype"/>
+                <w:color w:val="000000" w:themeColor="text1"/>
+                <w:sz w:val="24"/>
+                <w:szCs w:val="24"/>
+              </w:rPr>
+            </w:pPr>
+            <w:r>
+              <w:rPr>
+                <w:rFonts w:ascii="Palatino Linotype" w:hAnsi="Palatino Linotype"/>
+                <w:color w:val="000000" w:themeColor="text1"/>
+                <w:sz w:val="24"/>
+                <w:szCs w:val="24"/>
+              </w:rPr>
+              <w:t xml:space="preserve">(a) Verifies N was issued by this Vault. (b) Deletes N (one-time use). (c) Checks |now - T| &lt;= 30s. (d) Recomputes </w:t>
+            </w:r>
+            <w:proofErr w:type="spellStart"/>
+            <w:r>
+              <w:rPr>
+                <w:rFonts w:ascii="Palatino Linotype" w:hAnsi="Palatino Linotype"/>
+                <w:color w:val="000000" w:themeColor="text1"/>
+                <w:sz w:val="24"/>
+                <w:szCs w:val="24"/>
+              </w:rPr>
+              <w:t>expected_token</w:t>
+            </w:r>
+            <w:proofErr w:type="spellEnd"/>
+            <w:r>
+              <w:rPr>
+                <w:rFonts w:ascii="Palatino Linotype" w:hAnsi="Palatino Linotype"/>
+                <w:color w:val="000000" w:themeColor="text1"/>
+                <w:sz w:val="24"/>
+                <w:szCs w:val="24"/>
+              </w:rPr>
+              <w:t xml:space="preserve"> = HMAC-SHA256(K, N || T || </w:t>
+            </w:r>
+            <w:proofErr w:type="spellStart"/>
+            <w:r>
+              <w:rPr>
+                <w:rFonts w:ascii="Palatino Linotype" w:hAnsi="Palatino Linotype"/>
+                <w:color w:val="000000" w:themeColor="text1"/>
+                <w:sz w:val="24"/>
+                <w:szCs w:val="24"/>
+              </w:rPr>
+              <w:t>request_type</w:t>
+            </w:r>
+            <w:proofErr w:type="spellEnd"/>
+            <w:r>
+              <w:rPr>
+                <w:rFonts w:ascii="Palatino Linotype" w:hAnsi="Palatino Linotype"/>
+                <w:color w:val="000000" w:themeColor="text1"/>
+                <w:sz w:val="24"/>
+                <w:szCs w:val="24"/>
+              </w:rPr>
+              <w:t xml:space="preserve">). (e) Uses </w:t>
+            </w:r>
+            <w:proofErr w:type="spellStart"/>
+            <w:r>
+              <w:rPr>
+                <w:rFonts w:ascii="Palatino Linotype" w:hAnsi="Palatino Linotype"/>
+                <w:color w:val="000000" w:themeColor="text1"/>
+                <w:sz w:val="24"/>
+                <w:szCs w:val="24"/>
+              </w:rPr>
+              <w:t>hmac.compare_digest</w:t>
+            </w:r>
+            <w:proofErr w:type="spellEnd"/>
+            <w:r>
+              <w:rPr>
+                <w:rFonts w:ascii="Palatino Linotype" w:hAnsi="Palatino Linotype"/>
+                <w:color w:val="000000" w:themeColor="text1"/>
+                <w:sz w:val="24"/>
+                <w:szCs w:val="24"/>
+              </w:rPr>
+              <w:t>() for constant-time comparison.</w:t>
+            </w:r>
+          </w:p>
+        </w:tc>
+        <w:tc>
+          <w:tcPr>
+            <w:tcW w:w="2510" w:type="dxa"/>
+          </w:tcPr>
+          <w:p>
+            <w:pPr>
+              <w:spacing w:before="80" w:after="120"/>
               <w:jc w:val="center"/>
               <w:rPr>
                 <w:rFonts w:ascii="Palatino Linotype" w:hAnsi="Palatino Linotype"/>
@@ -3676,23 +3823,11 @@
       <w:tr>
         <w:tc>
           <w:tcPr>
-            <w:tcW w:w="600" w:type="dxa"/>
-            <w:tcBorders>
-              <w:top w:val="single" w:sz="1" w:space="0" w:color="AAAAAA"/>
-              <w:left w:val="single" w:sz="1" w:space="0" w:color="AAAAAA"/>
-              <w:bottom w:val="single" w:sz="1" w:space="0" w:color="AAAAAA"/>
-              <w:right w:val="single" w:sz="1" w:space="0" w:color="AAAAAA"/>
-            </w:tcBorders>
-            <w:shd w:val="clear" w:color="auto" w:fill="FFFFFF"/>
-            <w:tcMar>
-              <w:top w:w="80" w:type="dxa"/>
-              <w:left w:w="120" w:type="dxa"/>
-              <w:bottom w:w="80" w:type="dxa"/>
-              <w:right w:w="120" w:type="dxa"/>
-            </w:tcMar>
-          </w:tcPr>
-          <w:p>
-            <w:pPr>
+            <w:tcW w:w="2156" w:type="dxa"/>
+          </w:tcPr>
+          <w:p>
+            <w:pPr>
+              <w:spacing w:before="80" w:after="120"/>
               <w:jc w:val="center"/>
               <w:rPr>
                 <w:rFonts w:ascii="Palatino Linotype" w:hAnsi="Palatino Linotype"/>
@@ -3714,23 +3849,11 @@
         </w:tc>
         <w:tc>
           <w:tcPr>
-            <w:tcW w:w="2000" w:type="dxa"/>
-            <w:tcBorders>
-              <w:top w:val="single" w:sz="1" w:space="0" w:color="AAAAAA"/>
-              <w:left w:val="single" w:sz="1" w:space="0" w:color="AAAAAA"/>
-              <w:bottom w:val="single" w:sz="1" w:space="0" w:color="AAAAAA"/>
-              <w:right w:val="single" w:sz="1" w:space="0" w:color="AAAAAA"/>
-            </w:tcBorders>
-            <w:shd w:val="clear" w:color="auto" w:fill="FFFFFF"/>
-            <w:tcMar>
-              <w:top w:w="80" w:type="dxa"/>
-              <w:left w:w="120" w:type="dxa"/>
-              <w:bottom w:w="80" w:type="dxa"/>
-              <w:right w:w="120" w:type="dxa"/>
-            </w:tcMar>
-          </w:tcPr>
-          <w:p>
-            <w:pPr>
+            <w:tcW w:w="2167" w:type="dxa"/>
+          </w:tcPr>
+          <w:p>
+            <w:pPr>
+              <w:spacing w:before="80" w:after="120"/>
               <w:jc w:val="center"/>
               <w:rPr>
                 <w:rFonts w:ascii="Palatino Linotype" w:hAnsi="Palatino Linotype"/>
@@ -3752,23 +3875,11 @@
         </w:tc>
         <w:tc>
           <w:tcPr>
-            <w:tcW w:w="3213" w:type="dxa"/>
-            <w:tcBorders>
-              <w:top w:val="single" w:sz="1" w:space="0" w:color="AAAAAA"/>
-              <w:left w:val="single" w:sz="1" w:space="0" w:color="AAAAAA"/>
-              <w:bottom w:val="single" w:sz="1" w:space="0" w:color="AAAAAA"/>
-              <w:right w:val="single" w:sz="1" w:space="0" w:color="AAAAAA"/>
-            </w:tcBorders>
-            <w:shd w:val="clear" w:color="auto" w:fill="FFFFFF"/>
-            <w:tcMar>
-              <w:top w:w="80" w:type="dxa"/>
-              <w:left w:w="120" w:type="dxa"/>
-              <w:bottom w:w="80" w:type="dxa"/>
-              <w:right w:w="120" w:type="dxa"/>
-            </w:tcMar>
-          </w:tcPr>
-          <w:p>
-            <w:pPr>
+            <w:tcW w:w="2703" w:type="dxa"/>
+          </w:tcPr>
+          <w:p>
+            <w:pPr>
+              <w:spacing w:before="80" w:after="120"/>
               <w:jc w:val="center"/>
               <w:rPr>
                 <w:rFonts w:ascii="Palatino Linotype" w:hAnsi="Palatino Linotype"/>
@@ -3790,23 +3901,11 @@
         </w:tc>
         <w:tc>
           <w:tcPr>
-            <w:tcW w:w="3213" w:type="dxa"/>
-            <w:tcBorders>
-              <w:top w:val="single" w:sz="1" w:space="0" w:color="AAAAAA"/>
-              <w:left w:val="single" w:sz="1" w:space="0" w:color="AAAAAA"/>
-              <w:bottom w:val="single" w:sz="1" w:space="0" w:color="AAAAAA"/>
-              <w:right w:val="single" w:sz="1" w:space="0" w:color="AAAAAA"/>
-            </w:tcBorders>
-            <w:shd w:val="clear" w:color="auto" w:fill="FFFFFF"/>
-            <w:tcMar>
-              <w:top w:w="80" w:type="dxa"/>
-              <w:left w:w="120" w:type="dxa"/>
-              <w:bottom w:w="80" w:type="dxa"/>
-              <w:right w:w="120" w:type="dxa"/>
-            </w:tcMar>
-          </w:tcPr>
-          <w:p>
-            <w:pPr>
+            <w:tcW w:w="2510" w:type="dxa"/>
+          </w:tcPr>
+          <w:p>
+            <w:pPr>
+              <w:spacing w:before="80" w:after="120"/>
               <w:jc w:val="center"/>
               <w:rPr>
                 <w:rFonts w:ascii="Palatino Linotype" w:hAnsi="Palatino Linotype"/>
@@ -3892,7 +3991,27 @@
           <w:sz w:val="24"/>
           <w:szCs w:val="24"/>
         </w:rPr>
-        <w:t>The HMAC computation uses the shared secret K as the key. An attacker who intercepts the network traffic would observe only {N, T, request_type, token}. Without K, they cannot produce a valid token for any new nonce, because HMAC-SHA256's security relies on the computational infeasibility of forging a MAC without the key. Even if an attacker captures a valid token, the one-time-use nonce and the 30-second timestamp window ensure that replaying the captured token will be rejected by the Vault.</w:t>
+        <w:t xml:space="preserve">The HMAC computation uses the shared secret K as the key. An attacker who intercepts the network traffic would observe only {N, T, </w:t>
+      </w:r>
+      <w:proofErr w:type="spellStart"/>
+      <w:r>
+        <w:rPr>
+          <w:rFonts w:ascii="Palatino Linotype" w:hAnsi="Palatino Linotype"/>
+          <w:color w:val="000000" w:themeColor="text1"/>
+          <w:sz w:val="24"/>
+          <w:szCs w:val="24"/>
+        </w:rPr>
+        <w:t>request_type</w:t>
+      </w:r>
+      <w:proofErr w:type="spellEnd"/>
+      <w:r>
+        <w:rPr>
+          <w:rFonts w:ascii="Palatino Linotype" w:hAnsi="Palatino Linotype"/>
+          <w:color w:val="000000" w:themeColor="text1"/>
+          <w:sz w:val="24"/>
+          <w:szCs w:val="24"/>
+        </w:rPr>
+        <w:t>, token}. Without K, they cannot produce a valid token for any new nonce, because HMAC-SHA256's security relies on the computational infeasibility of forging a MAC without the key. Even if an attacker captures a valid token, the one-time-use nonce and the 30-second timestamp window ensure that replaying the captured token will be rejected by the Vault.</w:t>
       </w:r>
     </w:p>
     <w:p>
@@ -3913,21 +4032,61 @@
           <w:sz w:val="24"/>
           <w:szCs w:val="24"/>
         </w:rPr>
-        <w:t>The constant-time comparison (hmac.compare_digest) prevents timing side-channel attacks, where an attacker could otherwise infer how many bytes of the correct HMAC they have guessed by measuring response times. The combination of nonce, timestamp, request type, and HMAC ensures that every authentication event is unique, bound to a specific operation type, and time-limited.</w:t>
+        <w:t>The constant-time comparison (</w:t>
+      </w:r>
+      <w:proofErr w:type="spellStart"/>
+      <w:r>
+        <w:rPr>
+          <w:rFonts w:ascii="Palatino Linotype" w:hAnsi="Palatino Linotype"/>
+          <w:color w:val="000000" w:themeColor="text1"/>
+          <w:sz w:val="24"/>
+          <w:szCs w:val="24"/>
+        </w:rPr>
+        <w:t>hmac.compare_digest</w:t>
+      </w:r>
+      <w:proofErr w:type="spellEnd"/>
+      <w:r>
+        <w:rPr>
+          <w:rFonts w:ascii="Palatino Linotype" w:hAnsi="Palatino Linotype"/>
+          <w:color w:val="000000" w:themeColor="text1"/>
+          <w:sz w:val="24"/>
+          <w:szCs w:val="24"/>
+        </w:rPr>
+        <w:t xml:space="preserve">) prevents timing side-channel attacks, where an attacker could otherwise infer how many bytes of the correct HMAC they have guessed by measuring response times. The combination of nonce, </w:t>
+      </w:r>
+      <w:r>
+        <w:rPr>
+          <w:rFonts w:ascii="Palatino Linotype" w:hAnsi="Palatino Linotype"/>
+          <w:color w:val="000000" w:themeColor="text1"/>
+          <w:sz w:val="24"/>
+          <w:szCs w:val="24"/>
+        </w:rPr>
+        <w:lastRenderedPageBreak/>
+        <w:t xml:space="preserve">timestamp, request type, and HMAC ensures that every authentication event is unique, bound to a specific operation type, and </w:t>
+      </w:r>
+      <w:r>
+        <w:rPr>
+          <w:rFonts w:ascii="Palatino Linotype" w:hAnsi="Palatino Linotype"/>
+          <w:color w:val="000000" w:themeColor="text1"/>
+          <w:sz w:val="24"/>
+          <w:szCs w:val="24"/>
+        </w:rPr>
+        <w:t>time limited</w:t>
+      </w:r>
+      <w:r>
+        <w:rPr>
+          <w:rFonts w:ascii="Palatino Linotype" w:hAnsi="Palatino Linotype"/>
+          <w:color w:val="000000" w:themeColor="text1"/>
+          <w:sz w:val="24"/>
+          <w:szCs w:val="24"/>
+        </w:rPr>
+        <w:t>.</w:t>
       </w:r>
     </w:p>
     <w:p>
       <w:pPr>
         <w:spacing w:before="200" w:after="80"/>
         <w:jc w:val="center"/>
-        <w:rPr>
-          <w:rFonts w:ascii="Palatino Linotype" w:hAnsi="Palatino Linotype"/>
-          <w:color w:val="000000" w:themeColor="text1"/>
-          <w:sz w:val="24"/>
-          <w:szCs w:val="24"/>
-        </w:rPr>
-      </w:pPr>
-      <w:r>
         <w:rPr>
           <w:rFonts w:ascii="Palatino Linotype" w:hAnsi="Palatino Linotype"/>
           <w:b/>
@@ -3936,54 +4095,38 @@
           <w:sz w:val="24"/>
           <w:szCs w:val="24"/>
         </w:rPr>
+      </w:pPr>
+      <w:r>
+        <w:rPr>
+          <w:rFonts w:ascii="Palatino Linotype" w:hAnsi="Palatino Linotype"/>
+          <w:b/>
+          <w:bCs/>
+          <w:color w:val="000000" w:themeColor="text1"/>
+          <w:sz w:val="24"/>
+          <w:szCs w:val="24"/>
+        </w:rPr>
         <w:t>2.2.5 Security Design Principles Applied</w:t>
       </w:r>
     </w:p>
     <w:tbl>
       <w:tblPr>
-        <w:tblW w:w="9026" w:type="dxa"/>
-        <w:tblBorders>
-          <w:top w:val="single" w:sz="4" w:space="0" w:color="auto"/>
-          <w:left w:val="single" w:sz="4" w:space="0" w:color="auto"/>
-          <w:bottom w:val="single" w:sz="4" w:space="0" w:color="auto"/>
-          <w:right w:val="single" w:sz="4" w:space="0" w:color="auto"/>
-          <w:insideH w:val="single" w:sz="4" w:space="0" w:color="auto"/>
-          <w:insideV w:val="single" w:sz="4" w:space="0" w:color="auto"/>
-        </w:tblBorders>
-        <w:tblCellMar>
-          <w:left w:w="10" w:type="dxa"/>
-          <w:right w:w="10" w:type="dxa"/>
-        </w:tblCellMar>
+        <w:tblStyle w:val="TableGrid"/>
+        <w:tblW w:w="9014" w:type="dxa"/>
         <w:tblLook w:val="04A0" w:firstRow="1" w:lastRow="0" w:firstColumn="1" w:lastColumn="0" w:noHBand="0" w:noVBand="1"/>
       </w:tblPr>
       <w:tblGrid>
-        <w:gridCol w:w="2800"/>
-        <w:gridCol w:w="3113"/>
-        <w:gridCol w:w="3113"/>
+        <w:gridCol w:w="3004"/>
+        <w:gridCol w:w="3005"/>
+        <w:gridCol w:w="3005"/>
       </w:tblGrid>
       <w:tr>
-        <w:trPr>
-          <w:tblHeader/>
-        </w:trPr>
-        <w:tc>
-          <w:tcPr>
-            <w:tcW w:w="2800" w:type="dxa"/>
-            <w:tcBorders>
-              <w:top w:val="single" w:sz="1" w:space="0" w:color="2E4057"/>
-              <w:left w:val="single" w:sz="1" w:space="0" w:color="2E4057"/>
-              <w:bottom w:val="single" w:sz="1" w:space="0" w:color="2E4057"/>
-              <w:right w:val="single" w:sz="1" w:space="0" w:color="2E4057"/>
-            </w:tcBorders>
-            <w:shd w:val="clear" w:color="auto" w:fill="2E4057"/>
-            <w:tcMar>
-              <w:top w:w="100" w:type="dxa"/>
-              <w:left w:w="140" w:type="dxa"/>
-              <w:bottom w:w="100" w:type="dxa"/>
-              <w:right w:w="140" w:type="dxa"/>
-            </w:tcMar>
-          </w:tcPr>
-          <w:p>
-            <w:pPr>
+        <w:tc>
+          <w:tcPr>
+            <w:tcW w:w="3004" w:type="dxa"/>
+          </w:tcPr>
+          <w:p>
+            <w:pPr>
+              <w:spacing w:before="200" w:after="80"/>
               <w:jc w:val="center"/>
               <w:rPr>
                 <w:rFonts w:ascii="Palatino Linotype" w:hAnsi="Palatino Linotype"/>
@@ -4001,30 +4144,17 @@
                 <w:sz w:val="24"/>
                 <w:szCs w:val="24"/>
               </w:rPr>
-              <w:lastRenderedPageBreak/>
               <w:t>Design Principle</w:t>
             </w:r>
           </w:p>
         </w:tc>
         <w:tc>
           <w:tcPr>
-            <w:tcW w:w="3113" w:type="dxa"/>
-            <w:tcBorders>
-              <w:top w:val="single" w:sz="1" w:space="0" w:color="2E4057"/>
-              <w:left w:val="single" w:sz="1" w:space="0" w:color="2E4057"/>
-              <w:bottom w:val="single" w:sz="1" w:space="0" w:color="2E4057"/>
-              <w:right w:val="single" w:sz="1" w:space="0" w:color="2E4057"/>
-            </w:tcBorders>
-            <w:shd w:val="clear" w:color="auto" w:fill="2E4057"/>
-            <w:tcMar>
-              <w:top w:w="100" w:type="dxa"/>
-              <w:left w:w="140" w:type="dxa"/>
-              <w:bottom w:w="100" w:type="dxa"/>
-              <w:right w:w="140" w:type="dxa"/>
-            </w:tcMar>
-          </w:tcPr>
-          <w:p>
-            <w:pPr>
+            <w:tcW w:w="3005" w:type="dxa"/>
+          </w:tcPr>
+          <w:p>
+            <w:pPr>
+              <w:spacing w:before="200" w:after="80"/>
               <w:jc w:val="center"/>
               <w:rPr>
                 <w:rFonts w:ascii="Palatino Linotype" w:hAnsi="Palatino Linotype"/>
@@ -4048,23 +4178,11 @@
         </w:tc>
         <w:tc>
           <w:tcPr>
-            <w:tcW w:w="3113" w:type="dxa"/>
-            <w:tcBorders>
-              <w:top w:val="single" w:sz="1" w:space="0" w:color="2E4057"/>
-              <w:left w:val="single" w:sz="1" w:space="0" w:color="2E4057"/>
-              <w:bottom w:val="single" w:sz="1" w:space="0" w:color="2E4057"/>
-              <w:right w:val="single" w:sz="1" w:space="0" w:color="2E4057"/>
-            </w:tcBorders>
-            <w:shd w:val="clear" w:color="auto" w:fill="2E4057"/>
-            <w:tcMar>
-              <w:top w:w="100" w:type="dxa"/>
-              <w:left w:w="140" w:type="dxa"/>
-              <w:bottom w:w="100" w:type="dxa"/>
-              <w:right w:w="140" w:type="dxa"/>
-            </w:tcMar>
-          </w:tcPr>
-          <w:p>
-            <w:pPr>
+            <w:tcW w:w="3005" w:type="dxa"/>
+          </w:tcPr>
+          <w:p>
+            <w:pPr>
+              <w:spacing w:before="200" w:after="80"/>
               <w:jc w:val="center"/>
               <w:rPr>
                 <w:rFonts w:ascii="Palatino Linotype" w:hAnsi="Palatino Linotype"/>
@@ -4090,23 +4208,11 @@
       <w:tr>
         <w:tc>
           <w:tcPr>
-            <w:tcW w:w="2800" w:type="dxa"/>
-            <w:tcBorders>
-              <w:top w:val="single" w:sz="1" w:space="0" w:color="AAAAAA"/>
-              <w:left w:val="single" w:sz="1" w:space="0" w:color="AAAAAA"/>
-              <w:bottom w:val="single" w:sz="1" w:space="0" w:color="AAAAAA"/>
-              <w:right w:val="single" w:sz="1" w:space="0" w:color="AAAAAA"/>
-            </w:tcBorders>
-            <w:shd w:val="clear" w:color="auto" w:fill="F8F9FA"/>
-            <w:tcMar>
-              <w:top w:w="80" w:type="dxa"/>
-              <w:left w:w="120" w:type="dxa"/>
-              <w:bottom w:w="80" w:type="dxa"/>
-              <w:right w:w="120" w:type="dxa"/>
-            </w:tcMar>
-          </w:tcPr>
-          <w:p>
-            <w:pPr>
+            <w:tcW w:w="3004" w:type="dxa"/>
+          </w:tcPr>
+          <w:p>
+            <w:pPr>
+              <w:spacing w:before="200" w:after="80"/>
               <w:jc w:val="center"/>
               <w:rPr>
                 <w:rFonts w:ascii="Palatino Linotype" w:hAnsi="Palatino Linotype"/>
@@ -4128,23 +4234,11 @@
         </w:tc>
         <w:tc>
           <w:tcPr>
-            <w:tcW w:w="3113" w:type="dxa"/>
-            <w:tcBorders>
-              <w:top w:val="single" w:sz="1" w:space="0" w:color="AAAAAA"/>
-              <w:left w:val="single" w:sz="1" w:space="0" w:color="AAAAAA"/>
-              <w:bottom w:val="single" w:sz="1" w:space="0" w:color="AAAAAA"/>
-              <w:right w:val="single" w:sz="1" w:space="0" w:color="AAAAAA"/>
-            </w:tcBorders>
-            <w:shd w:val="clear" w:color="auto" w:fill="F8F9FA"/>
-            <w:tcMar>
-              <w:top w:w="80" w:type="dxa"/>
-              <w:left w:w="120" w:type="dxa"/>
-              <w:bottom w:w="80" w:type="dxa"/>
-              <w:right w:w="120" w:type="dxa"/>
-            </w:tcMar>
-          </w:tcPr>
-          <w:p>
-            <w:pPr>
+            <w:tcW w:w="3005" w:type="dxa"/>
+          </w:tcPr>
+          <w:p>
+            <w:pPr>
+              <w:spacing w:before="200" w:after="80"/>
               <w:jc w:val="center"/>
               <w:rPr>
                 <w:rFonts w:ascii="Palatino Linotype" w:hAnsi="Palatino Linotype"/>
@@ -4166,23 +4260,11 @@
         </w:tc>
         <w:tc>
           <w:tcPr>
-            <w:tcW w:w="3113" w:type="dxa"/>
-            <w:tcBorders>
-              <w:top w:val="single" w:sz="1" w:space="0" w:color="AAAAAA"/>
-              <w:left w:val="single" w:sz="1" w:space="0" w:color="AAAAAA"/>
-              <w:bottom w:val="single" w:sz="1" w:space="0" w:color="AAAAAA"/>
-              <w:right w:val="single" w:sz="1" w:space="0" w:color="AAAAAA"/>
-            </w:tcBorders>
-            <w:shd w:val="clear" w:color="auto" w:fill="F8F9FA"/>
-            <w:tcMar>
-              <w:top w:w="80" w:type="dxa"/>
-              <w:left w:w="120" w:type="dxa"/>
-              <w:bottom w:w="80" w:type="dxa"/>
-              <w:right w:w="120" w:type="dxa"/>
-            </w:tcMar>
-          </w:tcPr>
-          <w:p>
-            <w:pPr>
+            <w:tcW w:w="3005" w:type="dxa"/>
+          </w:tcPr>
+          <w:p>
+            <w:pPr>
+              <w:spacing w:before="200" w:after="80"/>
               <w:jc w:val="center"/>
               <w:rPr>
                 <w:rFonts w:ascii="Palatino Linotype" w:hAnsi="Palatino Linotype"/>
@@ -4206,23 +4288,11 @@
       <w:tr>
         <w:tc>
           <w:tcPr>
-            <w:tcW w:w="2800" w:type="dxa"/>
-            <w:tcBorders>
-              <w:top w:val="single" w:sz="1" w:space="0" w:color="AAAAAA"/>
-              <w:left w:val="single" w:sz="1" w:space="0" w:color="AAAAAA"/>
-              <w:bottom w:val="single" w:sz="1" w:space="0" w:color="AAAAAA"/>
-              <w:right w:val="single" w:sz="1" w:space="0" w:color="AAAAAA"/>
-            </w:tcBorders>
-            <w:shd w:val="clear" w:color="auto" w:fill="FFFFFF"/>
-            <w:tcMar>
-              <w:top w:w="80" w:type="dxa"/>
-              <w:left w:w="120" w:type="dxa"/>
-              <w:bottom w:w="80" w:type="dxa"/>
-              <w:right w:w="120" w:type="dxa"/>
-            </w:tcMar>
-          </w:tcPr>
-          <w:p>
-            <w:pPr>
+            <w:tcW w:w="3004" w:type="dxa"/>
+          </w:tcPr>
+          <w:p>
+            <w:pPr>
+              <w:spacing w:before="200" w:after="80"/>
               <w:jc w:val="center"/>
               <w:rPr>
                 <w:rFonts w:ascii="Palatino Linotype" w:hAnsi="Palatino Linotype"/>
@@ -4244,23 +4314,11 @@
         </w:tc>
         <w:tc>
           <w:tcPr>
-            <w:tcW w:w="3113" w:type="dxa"/>
-            <w:tcBorders>
-              <w:top w:val="single" w:sz="1" w:space="0" w:color="AAAAAA"/>
-              <w:left w:val="single" w:sz="1" w:space="0" w:color="AAAAAA"/>
-              <w:bottom w:val="single" w:sz="1" w:space="0" w:color="AAAAAA"/>
-              <w:right w:val="single" w:sz="1" w:space="0" w:color="AAAAAA"/>
-            </w:tcBorders>
-            <w:shd w:val="clear" w:color="auto" w:fill="FFFFFF"/>
-            <w:tcMar>
-              <w:top w:w="80" w:type="dxa"/>
-              <w:left w:w="120" w:type="dxa"/>
-              <w:bottom w:w="80" w:type="dxa"/>
-              <w:right w:w="120" w:type="dxa"/>
-            </w:tcMar>
-          </w:tcPr>
-          <w:p>
-            <w:pPr>
+            <w:tcW w:w="3005" w:type="dxa"/>
+          </w:tcPr>
+          <w:p>
+            <w:pPr>
+              <w:spacing w:before="200" w:after="80"/>
               <w:jc w:val="center"/>
               <w:rPr>
                 <w:rFonts w:ascii="Palatino Linotype" w:hAnsi="Palatino Linotype"/>
@@ -4282,23 +4340,11 @@
         </w:tc>
         <w:tc>
           <w:tcPr>
-            <w:tcW w:w="3113" w:type="dxa"/>
-            <w:tcBorders>
-              <w:top w:val="single" w:sz="1" w:space="0" w:color="AAAAAA"/>
-              <w:left w:val="single" w:sz="1" w:space="0" w:color="AAAAAA"/>
-              <w:bottom w:val="single" w:sz="1" w:space="0" w:color="AAAAAA"/>
-              <w:right w:val="single" w:sz="1" w:space="0" w:color="AAAAAA"/>
-            </w:tcBorders>
-            <w:shd w:val="clear" w:color="auto" w:fill="FFFFFF"/>
-            <w:tcMar>
-              <w:top w:w="80" w:type="dxa"/>
-              <w:left w:w="120" w:type="dxa"/>
-              <w:bottom w:w="80" w:type="dxa"/>
-              <w:right w:w="120" w:type="dxa"/>
-            </w:tcMar>
-          </w:tcPr>
-          <w:p>
-            <w:pPr>
+            <w:tcW w:w="3005" w:type="dxa"/>
+          </w:tcPr>
+          <w:p>
+            <w:pPr>
+              <w:spacing w:before="200" w:after="80"/>
               <w:jc w:val="center"/>
               <w:rPr>
                 <w:rFonts w:ascii="Palatino Linotype" w:hAnsi="Palatino Linotype"/>
@@ -4322,23 +4368,11 @@
       <w:tr>
         <w:tc>
           <w:tcPr>
-            <w:tcW w:w="2800" w:type="dxa"/>
-            <w:tcBorders>
-              <w:top w:val="single" w:sz="1" w:space="0" w:color="AAAAAA"/>
-              <w:left w:val="single" w:sz="1" w:space="0" w:color="AAAAAA"/>
-              <w:bottom w:val="single" w:sz="1" w:space="0" w:color="AAAAAA"/>
-              <w:right w:val="single" w:sz="1" w:space="0" w:color="AAAAAA"/>
-            </w:tcBorders>
-            <w:shd w:val="clear" w:color="auto" w:fill="F8F9FA"/>
-            <w:tcMar>
-              <w:top w:w="80" w:type="dxa"/>
-              <w:left w:w="120" w:type="dxa"/>
-              <w:bottom w:w="80" w:type="dxa"/>
-              <w:right w:w="120" w:type="dxa"/>
-            </w:tcMar>
-          </w:tcPr>
-          <w:p>
-            <w:pPr>
+            <w:tcW w:w="3004" w:type="dxa"/>
+          </w:tcPr>
+          <w:p>
+            <w:pPr>
+              <w:spacing w:before="200" w:after="80"/>
               <w:jc w:val="center"/>
               <w:rPr>
                 <w:rFonts w:ascii="Palatino Linotype" w:hAnsi="Palatino Linotype"/>
@@ -4360,23 +4394,11 @@
         </w:tc>
         <w:tc>
           <w:tcPr>
-            <w:tcW w:w="3113" w:type="dxa"/>
-            <w:tcBorders>
-              <w:top w:val="single" w:sz="1" w:space="0" w:color="AAAAAA"/>
-              <w:left w:val="single" w:sz="1" w:space="0" w:color="AAAAAA"/>
-              <w:bottom w:val="single" w:sz="1" w:space="0" w:color="AAAAAA"/>
-              <w:right w:val="single" w:sz="1" w:space="0" w:color="AAAAAA"/>
-            </w:tcBorders>
-            <w:shd w:val="clear" w:color="auto" w:fill="F8F9FA"/>
-            <w:tcMar>
-              <w:top w:w="80" w:type="dxa"/>
-              <w:left w:w="120" w:type="dxa"/>
-              <w:bottom w:w="80" w:type="dxa"/>
-              <w:right w:w="120" w:type="dxa"/>
-            </w:tcMar>
-          </w:tcPr>
-          <w:p>
-            <w:pPr>
+            <w:tcW w:w="3005" w:type="dxa"/>
+          </w:tcPr>
+          <w:p>
+            <w:pPr>
+              <w:spacing w:before="200" w:after="80"/>
               <w:jc w:val="center"/>
               <w:rPr>
                 <w:rFonts w:ascii="Palatino Linotype" w:hAnsi="Palatino Linotype"/>
@@ -4398,23 +4420,11 @@
         </w:tc>
         <w:tc>
           <w:tcPr>
-            <w:tcW w:w="3113" w:type="dxa"/>
-            <w:tcBorders>
-              <w:top w:val="single" w:sz="1" w:space="0" w:color="AAAAAA"/>
-              <w:left w:val="single" w:sz="1" w:space="0" w:color="AAAAAA"/>
-              <w:bottom w:val="single" w:sz="1" w:space="0" w:color="AAAAAA"/>
-              <w:right w:val="single" w:sz="1" w:space="0" w:color="AAAAAA"/>
-            </w:tcBorders>
-            <w:shd w:val="clear" w:color="auto" w:fill="F8F9FA"/>
-            <w:tcMar>
-              <w:top w:w="80" w:type="dxa"/>
-              <w:left w:w="120" w:type="dxa"/>
-              <w:bottom w:w="80" w:type="dxa"/>
-              <w:right w:w="120" w:type="dxa"/>
-            </w:tcMar>
-          </w:tcPr>
-          <w:p>
-            <w:pPr>
+            <w:tcW w:w="3005" w:type="dxa"/>
+          </w:tcPr>
+          <w:p>
+            <w:pPr>
+              <w:spacing w:before="200" w:after="80"/>
               <w:jc w:val="center"/>
               <w:rPr>
                 <w:rFonts w:ascii="Palatino Linotype" w:hAnsi="Palatino Linotype"/>
@@ -4438,23 +4448,11 @@
       <w:tr>
         <w:tc>
           <w:tcPr>
-            <w:tcW w:w="2800" w:type="dxa"/>
-            <w:tcBorders>
-              <w:top w:val="single" w:sz="1" w:space="0" w:color="AAAAAA"/>
-              <w:left w:val="single" w:sz="1" w:space="0" w:color="AAAAAA"/>
-              <w:bottom w:val="single" w:sz="1" w:space="0" w:color="AAAAAA"/>
-              <w:right w:val="single" w:sz="1" w:space="0" w:color="AAAAAA"/>
-            </w:tcBorders>
-            <w:shd w:val="clear" w:color="auto" w:fill="FFFFFF"/>
-            <w:tcMar>
-              <w:top w:w="80" w:type="dxa"/>
-              <w:left w:w="120" w:type="dxa"/>
-              <w:bottom w:w="80" w:type="dxa"/>
-              <w:right w:w="120" w:type="dxa"/>
-            </w:tcMar>
-          </w:tcPr>
-          <w:p>
-            <w:pPr>
+            <w:tcW w:w="3004" w:type="dxa"/>
+          </w:tcPr>
+          <w:p>
+            <w:pPr>
+              <w:spacing w:before="200" w:after="80"/>
               <w:jc w:val="center"/>
               <w:rPr>
                 <w:rFonts w:ascii="Palatino Linotype" w:hAnsi="Palatino Linotype"/>
@@ -4476,23 +4474,11 @@
         </w:tc>
         <w:tc>
           <w:tcPr>
-            <w:tcW w:w="3113" w:type="dxa"/>
-            <w:tcBorders>
-              <w:top w:val="single" w:sz="1" w:space="0" w:color="AAAAAA"/>
-              <w:left w:val="single" w:sz="1" w:space="0" w:color="AAAAAA"/>
-              <w:bottom w:val="single" w:sz="1" w:space="0" w:color="AAAAAA"/>
-              <w:right w:val="single" w:sz="1" w:space="0" w:color="AAAAAA"/>
-            </w:tcBorders>
-            <w:shd w:val="clear" w:color="auto" w:fill="FFFFFF"/>
-            <w:tcMar>
-              <w:top w:w="80" w:type="dxa"/>
-              <w:left w:w="120" w:type="dxa"/>
-              <w:bottom w:w="80" w:type="dxa"/>
-              <w:right w:w="120" w:type="dxa"/>
-            </w:tcMar>
-          </w:tcPr>
-          <w:p>
-            <w:pPr>
+            <w:tcW w:w="3005" w:type="dxa"/>
+          </w:tcPr>
+          <w:p>
+            <w:pPr>
+              <w:spacing w:before="200" w:after="80"/>
               <w:jc w:val="center"/>
               <w:rPr>
                 <w:rFonts w:ascii="Palatino Linotype" w:hAnsi="Palatino Linotype"/>
@@ -4514,23 +4500,11 @@
         </w:tc>
         <w:tc>
           <w:tcPr>
-            <w:tcW w:w="3113" w:type="dxa"/>
-            <w:tcBorders>
-              <w:top w:val="single" w:sz="1" w:space="0" w:color="AAAAAA"/>
-              <w:left w:val="single" w:sz="1" w:space="0" w:color="AAAAAA"/>
-              <w:bottom w:val="single" w:sz="1" w:space="0" w:color="AAAAAA"/>
-              <w:right w:val="single" w:sz="1" w:space="0" w:color="AAAAAA"/>
-            </w:tcBorders>
-            <w:shd w:val="clear" w:color="auto" w:fill="FFFFFF"/>
-            <w:tcMar>
-              <w:top w:w="80" w:type="dxa"/>
-              <w:left w:w="120" w:type="dxa"/>
-              <w:bottom w:w="80" w:type="dxa"/>
-              <w:right w:w="120" w:type="dxa"/>
-            </w:tcMar>
-          </w:tcPr>
-          <w:p>
-            <w:pPr>
+            <w:tcW w:w="3005" w:type="dxa"/>
+          </w:tcPr>
+          <w:p>
+            <w:pPr>
+              <w:spacing w:before="200" w:after="80"/>
               <w:jc w:val="center"/>
               <w:rPr>
                 <w:rFonts w:ascii="Palatino Linotype" w:hAnsi="Palatino Linotype"/>
@@ -4554,23 +4528,11 @@
       <w:tr>
         <w:tc>
           <w:tcPr>
-            <w:tcW w:w="2800" w:type="dxa"/>
-            <w:tcBorders>
-              <w:top w:val="single" w:sz="1" w:space="0" w:color="AAAAAA"/>
-              <w:left w:val="single" w:sz="1" w:space="0" w:color="AAAAAA"/>
-              <w:bottom w:val="single" w:sz="1" w:space="0" w:color="AAAAAA"/>
-              <w:right w:val="single" w:sz="1" w:space="0" w:color="AAAAAA"/>
-            </w:tcBorders>
-            <w:shd w:val="clear" w:color="auto" w:fill="F8F9FA"/>
-            <w:tcMar>
-              <w:top w:w="80" w:type="dxa"/>
-              <w:left w:w="120" w:type="dxa"/>
-              <w:bottom w:w="80" w:type="dxa"/>
-              <w:right w:w="120" w:type="dxa"/>
-            </w:tcMar>
-          </w:tcPr>
-          <w:p>
-            <w:pPr>
+            <w:tcW w:w="3004" w:type="dxa"/>
+          </w:tcPr>
+          <w:p>
+            <w:pPr>
+              <w:spacing w:before="200" w:after="80"/>
               <w:jc w:val="center"/>
               <w:rPr>
                 <w:rFonts w:ascii="Palatino Linotype" w:hAnsi="Palatino Linotype"/>
@@ -4592,23 +4554,11 @@
         </w:tc>
         <w:tc>
           <w:tcPr>
-            <w:tcW w:w="3113" w:type="dxa"/>
-            <w:tcBorders>
-              <w:top w:val="single" w:sz="1" w:space="0" w:color="AAAAAA"/>
-              <w:left w:val="single" w:sz="1" w:space="0" w:color="AAAAAA"/>
-              <w:bottom w:val="single" w:sz="1" w:space="0" w:color="AAAAAA"/>
-              <w:right w:val="single" w:sz="1" w:space="0" w:color="AAAAAA"/>
-            </w:tcBorders>
-            <w:shd w:val="clear" w:color="auto" w:fill="F8F9FA"/>
-            <w:tcMar>
-              <w:top w:w="80" w:type="dxa"/>
-              <w:left w:w="120" w:type="dxa"/>
-              <w:bottom w:w="80" w:type="dxa"/>
-              <w:right w:w="120" w:type="dxa"/>
-            </w:tcMar>
-          </w:tcPr>
-          <w:p>
-            <w:pPr>
+            <w:tcW w:w="3005" w:type="dxa"/>
+          </w:tcPr>
+          <w:p>
+            <w:pPr>
+              <w:spacing w:before="200" w:after="80"/>
               <w:jc w:val="center"/>
               <w:rPr>
                 <w:rFonts w:ascii="Palatino Linotype" w:hAnsi="Palatino Linotype"/>
@@ -4630,23 +4580,11 @@
         </w:tc>
         <w:tc>
           <w:tcPr>
-            <w:tcW w:w="3113" w:type="dxa"/>
-            <w:tcBorders>
-              <w:top w:val="single" w:sz="1" w:space="0" w:color="AAAAAA"/>
-              <w:left w:val="single" w:sz="1" w:space="0" w:color="AAAAAA"/>
-              <w:bottom w:val="single" w:sz="1" w:space="0" w:color="AAAAAA"/>
-              <w:right w:val="single" w:sz="1" w:space="0" w:color="AAAAAA"/>
-            </w:tcBorders>
-            <w:shd w:val="clear" w:color="auto" w:fill="F8F9FA"/>
-            <w:tcMar>
-              <w:top w:w="80" w:type="dxa"/>
-              <w:left w:w="120" w:type="dxa"/>
-              <w:bottom w:w="80" w:type="dxa"/>
-              <w:right w:w="120" w:type="dxa"/>
-            </w:tcMar>
-          </w:tcPr>
-          <w:p>
-            <w:pPr>
+            <w:tcW w:w="3005" w:type="dxa"/>
+          </w:tcPr>
+          <w:p>
+            <w:pPr>
+              <w:spacing w:before="200" w:after="80"/>
               <w:jc w:val="center"/>
               <w:rPr>
                 <w:rFonts w:ascii="Palatino Linotype" w:hAnsi="Palatino Linotype"/>
@@ -4670,23 +4608,11 @@
       <w:tr>
         <w:tc>
           <w:tcPr>
-            <w:tcW w:w="2800" w:type="dxa"/>
-            <w:tcBorders>
-              <w:top w:val="single" w:sz="1" w:space="0" w:color="AAAAAA"/>
-              <w:left w:val="single" w:sz="1" w:space="0" w:color="AAAAAA"/>
-              <w:bottom w:val="single" w:sz="1" w:space="0" w:color="AAAAAA"/>
-              <w:right w:val="single" w:sz="1" w:space="0" w:color="AAAAAA"/>
-            </w:tcBorders>
-            <w:shd w:val="clear" w:color="auto" w:fill="FFFFFF"/>
-            <w:tcMar>
-              <w:top w:w="80" w:type="dxa"/>
-              <w:left w:w="120" w:type="dxa"/>
-              <w:bottom w:w="80" w:type="dxa"/>
-              <w:right w:w="120" w:type="dxa"/>
-            </w:tcMar>
-          </w:tcPr>
-          <w:p>
-            <w:pPr>
+            <w:tcW w:w="3004" w:type="dxa"/>
+          </w:tcPr>
+          <w:p>
+            <w:pPr>
+              <w:spacing w:before="200" w:after="80"/>
               <w:jc w:val="center"/>
               <w:rPr>
                 <w:rFonts w:ascii="Palatino Linotype" w:hAnsi="Palatino Linotype"/>
@@ -4708,61 +4634,57 @@
         </w:tc>
         <w:tc>
           <w:tcPr>
-            <w:tcW w:w="3113" w:type="dxa"/>
-            <w:tcBorders>
-              <w:top w:val="single" w:sz="1" w:space="0" w:color="AAAAAA"/>
-              <w:left w:val="single" w:sz="1" w:space="0" w:color="AAAAAA"/>
-              <w:bottom w:val="single" w:sz="1" w:space="0" w:color="AAAAAA"/>
-              <w:right w:val="single" w:sz="1" w:space="0" w:color="AAAAAA"/>
-            </w:tcBorders>
-            <w:shd w:val="clear" w:color="auto" w:fill="FFFFFF"/>
-            <w:tcMar>
-              <w:top w:w="80" w:type="dxa"/>
-              <w:left w:w="120" w:type="dxa"/>
-              <w:bottom w:w="80" w:type="dxa"/>
-              <w:right w:w="120" w:type="dxa"/>
-            </w:tcMar>
-          </w:tcPr>
-          <w:p>
-            <w:pPr>
-              <w:jc w:val="center"/>
-              <w:rPr>
-                <w:rFonts w:ascii="Palatino Linotype" w:hAnsi="Palatino Linotype"/>
-                <w:color w:val="000000" w:themeColor="text1"/>
-                <w:sz w:val="24"/>
-                <w:szCs w:val="24"/>
-              </w:rPr>
-            </w:pPr>
-            <w:r>
-              <w:rPr>
-                <w:rFonts w:ascii="Palatino Linotype" w:hAnsi="Palatino Linotype"/>
-                <w:color w:val="000000" w:themeColor="text1"/>
-                <w:sz w:val="24"/>
-                <w:szCs w:val="24"/>
-              </w:rPr>
-              <w:t>Default deny: any failed check (nonce, timestamp, HMAC) results in access denial and audit log entry</w:t>
-            </w:r>
-          </w:p>
-        </w:tc>
-        <w:tc>
-          <w:tcPr>
-            <w:tcW w:w="3113" w:type="dxa"/>
-            <w:tcBorders>
-              <w:top w:val="single" w:sz="1" w:space="0" w:color="AAAAAA"/>
-              <w:left w:val="single" w:sz="1" w:space="0" w:color="AAAAAA"/>
-              <w:bottom w:val="single" w:sz="1" w:space="0" w:color="AAAAAA"/>
-              <w:right w:val="single" w:sz="1" w:space="0" w:color="AAAAAA"/>
-            </w:tcBorders>
-            <w:shd w:val="clear" w:color="auto" w:fill="FFFFFF"/>
-            <w:tcMar>
-              <w:top w:w="80" w:type="dxa"/>
-              <w:left w:w="120" w:type="dxa"/>
-              <w:bottom w:w="80" w:type="dxa"/>
-              <w:right w:w="120" w:type="dxa"/>
-            </w:tcMar>
-          </w:tcPr>
-          <w:p>
-            <w:pPr>
+            <w:tcW w:w="3005" w:type="dxa"/>
+          </w:tcPr>
+          <w:p>
+            <w:pPr>
+              <w:spacing w:before="200" w:after="80"/>
+              <w:jc w:val="center"/>
+              <w:rPr>
+                <w:rFonts w:ascii="Palatino Linotype" w:hAnsi="Palatino Linotype"/>
+                <w:color w:val="000000" w:themeColor="text1"/>
+                <w:sz w:val="24"/>
+                <w:szCs w:val="24"/>
+              </w:rPr>
+            </w:pPr>
+            <w:r>
+              <w:rPr>
+                <w:rFonts w:ascii="Palatino Linotype" w:hAnsi="Palatino Linotype"/>
+                <w:color w:val="000000" w:themeColor="text1"/>
+                <w:sz w:val="24"/>
+                <w:szCs w:val="24"/>
+              </w:rPr>
+              <w:t xml:space="preserve">Default </w:t>
+            </w:r>
+            <w:proofErr w:type="gramStart"/>
+            <w:r>
+              <w:rPr>
+                <w:rFonts w:ascii="Palatino Linotype" w:hAnsi="Palatino Linotype"/>
+                <w:color w:val="000000" w:themeColor="text1"/>
+                <w:sz w:val="24"/>
+                <w:szCs w:val="24"/>
+              </w:rPr>
+              <w:t>deny</w:t>
+            </w:r>
+            <w:proofErr w:type="gramEnd"/>
+            <w:r>
+              <w:rPr>
+                <w:rFonts w:ascii="Palatino Linotype" w:hAnsi="Palatino Linotype"/>
+                <w:color w:val="000000" w:themeColor="text1"/>
+                <w:sz w:val="24"/>
+                <w:szCs w:val="24"/>
+              </w:rPr>
+              <w:t>: any failed check (nonce, timestamp, HMAC) results in access denial and audit log entry</w:t>
+            </w:r>
+          </w:p>
+        </w:tc>
+        <w:tc>
+          <w:tcPr>
+            <w:tcW w:w="3005" w:type="dxa"/>
+          </w:tcPr>
+          <w:p>
+            <w:pPr>
+              <w:spacing w:before="200" w:after="80"/>
               <w:jc w:val="center"/>
               <w:rPr>
                 <w:rFonts w:ascii="Palatino Linotype" w:hAnsi="Palatino Linotype"/>
@@ -4786,23 +4708,11 @@
       <w:tr>
         <w:tc>
           <w:tcPr>
-            <w:tcW w:w="2800" w:type="dxa"/>
-            <w:tcBorders>
-              <w:top w:val="single" w:sz="1" w:space="0" w:color="AAAAAA"/>
-              <w:left w:val="single" w:sz="1" w:space="0" w:color="AAAAAA"/>
-              <w:bottom w:val="single" w:sz="1" w:space="0" w:color="AAAAAA"/>
-              <w:right w:val="single" w:sz="1" w:space="0" w:color="AAAAAA"/>
-            </w:tcBorders>
-            <w:shd w:val="clear" w:color="auto" w:fill="F8F9FA"/>
-            <w:tcMar>
-              <w:top w:w="80" w:type="dxa"/>
-              <w:left w:w="120" w:type="dxa"/>
-              <w:bottom w:w="80" w:type="dxa"/>
-              <w:right w:w="120" w:type="dxa"/>
-            </w:tcMar>
-          </w:tcPr>
-          <w:p>
-            <w:pPr>
+            <w:tcW w:w="3004" w:type="dxa"/>
+          </w:tcPr>
+          <w:p>
+            <w:pPr>
+              <w:spacing w:before="200" w:after="80"/>
               <w:jc w:val="center"/>
               <w:rPr>
                 <w:rFonts w:ascii="Palatino Linotype" w:hAnsi="Palatino Linotype"/>
@@ -4824,23 +4734,11 @@
         </w:tc>
         <w:tc>
           <w:tcPr>
-            <w:tcW w:w="3113" w:type="dxa"/>
-            <w:tcBorders>
-              <w:top w:val="single" w:sz="1" w:space="0" w:color="AAAAAA"/>
-              <w:left w:val="single" w:sz="1" w:space="0" w:color="AAAAAA"/>
-              <w:bottom w:val="single" w:sz="1" w:space="0" w:color="AAAAAA"/>
-              <w:right w:val="single" w:sz="1" w:space="0" w:color="AAAAAA"/>
-            </w:tcBorders>
-            <w:shd w:val="clear" w:color="auto" w:fill="F8F9FA"/>
-            <w:tcMar>
-              <w:top w:w="80" w:type="dxa"/>
-              <w:left w:w="120" w:type="dxa"/>
-              <w:bottom w:w="80" w:type="dxa"/>
-              <w:right w:w="120" w:type="dxa"/>
-            </w:tcMar>
-          </w:tcPr>
-          <w:p>
-            <w:pPr>
+            <w:tcW w:w="3005" w:type="dxa"/>
+          </w:tcPr>
+          <w:p>
+            <w:pPr>
+              <w:spacing w:before="200" w:after="80"/>
               <w:jc w:val="center"/>
               <w:rPr>
                 <w:rFonts w:ascii="Palatino Linotype" w:hAnsi="Palatino Linotype"/>
@@ -4862,23 +4760,11 @@
         </w:tc>
         <w:tc>
           <w:tcPr>
-            <w:tcW w:w="3113" w:type="dxa"/>
-            <w:tcBorders>
-              <w:top w:val="single" w:sz="1" w:space="0" w:color="AAAAAA"/>
-              <w:left w:val="single" w:sz="1" w:space="0" w:color="AAAAAA"/>
-              <w:bottom w:val="single" w:sz="1" w:space="0" w:color="AAAAAA"/>
-              <w:right w:val="single" w:sz="1" w:space="0" w:color="AAAAAA"/>
-            </w:tcBorders>
-            <w:shd w:val="clear" w:color="auto" w:fill="F8F9FA"/>
-            <w:tcMar>
-              <w:top w:w="80" w:type="dxa"/>
-              <w:left w:w="120" w:type="dxa"/>
-              <w:bottom w:w="80" w:type="dxa"/>
-              <w:right w:w="120" w:type="dxa"/>
-            </w:tcMar>
-          </w:tcPr>
-          <w:p>
-            <w:pPr>
+            <w:tcW w:w="3005" w:type="dxa"/>
+          </w:tcPr>
+          <w:p>
+            <w:pPr>
+              <w:spacing w:before="200" w:after="80"/>
               <w:jc w:val="center"/>
               <w:rPr>
                 <w:rFonts w:ascii="Palatino Linotype" w:hAnsi="Palatino Linotype"/>
@@ -4902,61 +4788,38 @@
       <w:tr>
         <w:tc>
           <w:tcPr>
-            <w:tcW w:w="2800" w:type="dxa"/>
-            <w:tcBorders>
-              <w:top w:val="single" w:sz="1" w:space="0" w:color="AAAAAA"/>
-              <w:left w:val="single" w:sz="1" w:space="0" w:color="AAAAAA"/>
-              <w:bottom w:val="single" w:sz="1" w:space="0" w:color="AAAAAA"/>
-              <w:right w:val="single" w:sz="1" w:space="0" w:color="AAAAAA"/>
-            </w:tcBorders>
-            <w:shd w:val="clear" w:color="auto" w:fill="FFFFFF"/>
-            <w:tcMar>
-              <w:top w:w="80" w:type="dxa"/>
-              <w:left w:w="120" w:type="dxa"/>
-              <w:bottom w:w="80" w:type="dxa"/>
-              <w:right w:w="120" w:type="dxa"/>
-            </w:tcMar>
-          </w:tcPr>
-          <w:p>
-            <w:pPr>
-              <w:jc w:val="center"/>
-              <w:rPr>
-                <w:rFonts w:ascii="Palatino Linotype" w:hAnsi="Palatino Linotype"/>
-                <w:color w:val="000000" w:themeColor="text1"/>
-                <w:sz w:val="24"/>
-                <w:szCs w:val="24"/>
-              </w:rPr>
-            </w:pPr>
-            <w:r>
-              <w:rPr>
-                <w:rFonts w:ascii="Palatino Linotype" w:hAnsi="Palatino Linotype"/>
-                <w:color w:val="000000" w:themeColor="text1"/>
-                <w:sz w:val="24"/>
-                <w:szCs w:val="24"/>
-              </w:rPr>
+            <w:tcW w:w="3004" w:type="dxa"/>
+          </w:tcPr>
+          <w:p>
+            <w:pPr>
+              <w:spacing w:before="200" w:after="80"/>
+              <w:jc w:val="center"/>
+              <w:rPr>
+                <w:rFonts w:ascii="Palatino Linotype" w:hAnsi="Palatino Linotype"/>
+                <w:color w:val="000000" w:themeColor="text1"/>
+                <w:sz w:val="24"/>
+                <w:szCs w:val="24"/>
+              </w:rPr>
+            </w:pPr>
+            <w:r>
+              <w:rPr>
+                <w:rFonts w:ascii="Palatino Linotype" w:hAnsi="Palatino Linotype"/>
+                <w:color w:val="000000" w:themeColor="text1"/>
+                <w:sz w:val="24"/>
+                <w:szCs w:val="24"/>
+              </w:rPr>
+              <w:lastRenderedPageBreak/>
               <w:t>Psychological Acceptability</w:t>
             </w:r>
           </w:p>
         </w:tc>
         <w:tc>
           <w:tcPr>
-            <w:tcW w:w="3113" w:type="dxa"/>
-            <w:tcBorders>
-              <w:top w:val="single" w:sz="1" w:space="0" w:color="AAAAAA"/>
-              <w:left w:val="single" w:sz="1" w:space="0" w:color="AAAAAA"/>
-              <w:bottom w:val="single" w:sz="1" w:space="0" w:color="AAAAAA"/>
-              <w:right w:val="single" w:sz="1" w:space="0" w:color="AAAAAA"/>
-            </w:tcBorders>
-            <w:shd w:val="clear" w:color="auto" w:fill="FFFFFF"/>
-            <w:tcMar>
-              <w:top w:w="80" w:type="dxa"/>
-              <w:left w:w="120" w:type="dxa"/>
-              <w:bottom w:w="80" w:type="dxa"/>
-              <w:right w:w="120" w:type="dxa"/>
-            </w:tcMar>
-          </w:tcPr>
-          <w:p>
-            <w:pPr>
+            <w:tcW w:w="3005" w:type="dxa"/>
+          </w:tcPr>
+          <w:p>
+            <w:pPr>
+              <w:spacing w:before="200" w:after="80"/>
               <w:jc w:val="center"/>
               <w:rPr>
                 <w:rFonts w:ascii="Palatino Linotype" w:hAnsi="Palatino Linotype"/>
@@ -4978,23 +4841,11 @@
         </w:tc>
         <w:tc>
           <w:tcPr>
-            <w:tcW w:w="3113" w:type="dxa"/>
-            <w:tcBorders>
-              <w:top w:val="single" w:sz="1" w:space="0" w:color="AAAAAA"/>
-              <w:left w:val="single" w:sz="1" w:space="0" w:color="AAAAAA"/>
-              <w:bottom w:val="single" w:sz="1" w:space="0" w:color="AAAAAA"/>
-              <w:right w:val="single" w:sz="1" w:space="0" w:color="AAAAAA"/>
-            </w:tcBorders>
-            <w:shd w:val="clear" w:color="auto" w:fill="FFFFFF"/>
-            <w:tcMar>
-              <w:top w:w="80" w:type="dxa"/>
-              <w:left w:w="120" w:type="dxa"/>
-              <w:bottom w:w="80" w:type="dxa"/>
-              <w:right w:w="120" w:type="dxa"/>
-            </w:tcMar>
-          </w:tcPr>
-          <w:p>
-            <w:pPr>
+            <w:tcW w:w="3005" w:type="dxa"/>
+          </w:tcPr>
+          <w:p>
+            <w:pPr>
+              <w:spacing w:before="200" w:after="80"/>
               <w:jc w:val="center"/>
               <w:rPr>
                 <w:rFonts w:ascii="Palatino Linotype" w:hAnsi="Palatino Linotype"/>
@@ -5036,7 +4887,29 @@
           <w:sz w:val="24"/>
           <w:szCs w:val="24"/>
         </w:rPr>
-        <w:t>Table 4: Security Design Principles — Mechanism 2</w:t>
+        <w:t xml:space="preserve">Table 4: Security Design Principles </w:t>
+      </w:r>
+      <w:r>
+        <w:rPr>
+          <w:rFonts w:ascii="Palatino Linotype" w:hAnsi="Palatino Linotype"/>
+          <w:i/>
+          <w:iCs/>
+          <w:color w:val="000000" w:themeColor="text1"/>
+          <w:sz w:val="24"/>
+          <w:szCs w:val="24"/>
+        </w:rPr>
+        <w:t>-</w:t>
+      </w:r>
+      <w:r>
+        <w:rPr>
+          <w:rFonts w:ascii="Palatino Linotype" w:hAnsi="Palatino Linotype"/>
+          <w:i/>
+          <w:iCs/>
+          <w:color w:val="000000" w:themeColor="text1"/>
+          <w:sz w:val="24"/>
+          <w:szCs w:val="24"/>
+        </w:rPr>
+        <w:t xml:space="preserve"> Mechanism 2</w:t>
       </w:r>
     </w:p>
     <w:p>
@@ -5066,19 +4939,19 @@
         <w:rPr>
           <w:rFonts w:ascii="Palatino Linotype" w:hAnsi="Palatino Linotype"/>
           <w:color w:val="000000" w:themeColor="text1"/>
-          <w:sz w:val="24"/>
-          <w:szCs w:val="24"/>
-        </w:rPr>
-      </w:pPr>
-      <w:r>
-        <w:rPr>
-          <w:rFonts w:ascii="Palatino Linotype" w:hAnsi="Palatino Linotype"/>
-          <w:color w:val="000000" w:themeColor="text1"/>
-          <w:sz w:val="24"/>
-          <w:szCs w:val="24"/>
+          <w:sz w:val="32"/>
+          <w:szCs w:val="32"/>
+        </w:rPr>
+      </w:pPr>
+      <w:r>
+        <w:rPr>
+          <w:rFonts w:ascii="Palatino Linotype" w:hAnsi="Palatino Linotype"/>
+          <w:color w:val="000000" w:themeColor="text1"/>
+          <w:sz w:val="32"/>
+          <w:szCs w:val="32"/>
         </w:rPr>
         <w:lastRenderedPageBreak/>
-        <w:t>3. Section 2 – Implementation of Mechanism 2</w:t>
+        <w:t>3. Section 2 Implementation of Mechanism 2</w:t>
       </w:r>
     </w:p>
     <w:p>
@@ -5172,14 +5045,65 @@
           <w:szCs w:val="24"/>
         </w:rPr>
       </w:pPr>
-      <w:r>
-        <w:rPr>
-          <w:rFonts w:ascii="Palatino Linotype" w:hAnsi="Palatino Linotype"/>
-          <w:color w:val="000000" w:themeColor="text1"/>
-          <w:sz w:val="24"/>
-          <w:szCs w:val="24"/>
-        </w:rPr>
-        <w:t>PasswordVault: simulates the vault/database. Exposes issue_challenge() and verify_and_grant() methods. Maintains an internal audit log. Performs all five verification checks in Step 5 of the protocol.</w:t>
+      <w:proofErr w:type="spellStart"/>
+      <w:r>
+        <w:rPr>
+          <w:rFonts w:ascii="Palatino Linotype" w:hAnsi="Palatino Linotype"/>
+          <w:color w:val="000000" w:themeColor="text1"/>
+          <w:sz w:val="24"/>
+          <w:szCs w:val="24"/>
+        </w:rPr>
+        <w:t>PasswordVault</w:t>
+      </w:r>
+      <w:proofErr w:type="spellEnd"/>
+      <w:r>
+        <w:rPr>
+          <w:rFonts w:ascii="Palatino Linotype" w:hAnsi="Palatino Linotype"/>
+          <w:color w:val="000000" w:themeColor="text1"/>
+          <w:sz w:val="24"/>
+          <w:szCs w:val="24"/>
+        </w:rPr>
+        <w:t xml:space="preserve">: simulates the vault/database. Exposes </w:t>
+      </w:r>
+      <w:proofErr w:type="spellStart"/>
+      <w:r>
+        <w:rPr>
+          <w:rFonts w:ascii="Palatino Linotype" w:hAnsi="Palatino Linotype"/>
+          <w:color w:val="000000" w:themeColor="text1"/>
+          <w:sz w:val="24"/>
+          <w:szCs w:val="24"/>
+        </w:rPr>
+        <w:t>issue_challenge</w:t>
+      </w:r>
+      <w:proofErr w:type="spellEnd"/>
+      <w:r>
+        <w:rPr>
+          <w:rFonts w:ascii="Palatino Linotype" w:hAnsi="Palatino Linotype"/>
+          <w:color w:val="000000" w:themeColor="text1"/>
+          <w:sz w:val="24"/>
+          <w:szCs w:val="24"/>
+        </w:rPr>
+        <w:t xml:space="preserve">() and </w:t>
+      </w:r>
+      <w:proofErr w:type="spellStart"/>
+      <w:r>
+        <w:rPr>
+          <w:rFonts w:ascii="Palatino Linotype" w:hAnsi="Palatino Linotype"/>
+          <w:color w:val="000000" w:themeColor="text1"/>
+          <w:sz w:val="24"/>
+          <w:szCs w:val="24"/>
+        </w:rPr>
+        <w:t>verify_and_grant</w:t>
+      </w:r>
+      <w:proofErr w:type="spellEnd"/>
+      <w:r>
+        <w:rPr>
+          <w:rFonts w:ascii="Palatino Linotype" w:hAnsi="Palatino Linotype"/>
+          <w:color w:val="000000" w:themeColor="text1"/>
+          <w:sz w:val="24"/>
+          <w:szCs w:val="24"/>
+        </w:rPr>
+        <w:t>() methods. Maintains an internal audit log. Performs all five verification checks in Step 5 of the protocol.</w:t>
       </w:r>
     </w:p>
     <w:p>
@@ -5197,14 +5121,65 @@
           <w:szCs w:val="24"/>
         </w:rPr>
       </w:pPr>
-      <w:r>
-        <w:rPr>
-          <w:rFonts w:ascii="Palatino Linotype" w:hAnsi="Palatino Linotype"/>
-          <w:color w:val="000000" w:themeColor="text1"/>
-          <w:sz w:val="24"/>
-          <w:szCs w:val="24"/>
-        </w:rPr>
-        <w:t>PasswordServer: simulates the application server. Implements the full _authenticate() handshake and exposes authenticated vault operations (add_password, retrieve_password).</w:t>
+      <w:proofErr w:type="spellStart"/>
+      <w:r>
+        <w:rPr>
+          <w:rFonts w:ascii="Palatino Linotype" w:hAnsi="Palatino Linotype"/>
+          <w:color w:val="000000" w:themeColor="text1"/>
+          <w:sz w:val="24"/>
+          <w:szCs w:val="24"/>
+        </w:rPr>
+        <w:t>PasswordServer</w:t>
+      </w:r>
+      <w:proofErr w:type="spellEnd"/>
+      <w:r>
+        <w:rPr>
+          <w:rFonts w:ascii="Palatino Linotype" w:hAnsi="Palatino Linotype"/>
+          <w:color w:val="000000" w:themeColor="text1"/>
+          <w:sz w:val="24"/>
+          <w:szCs w:val="24"/>
+        </w:rPr>
+        <w:t>: simulates the application server. Implements the full _authenticate() handshake and exposes authenticated vault operations (</w:t>
+      </w:r>
+      <w:proofErr w:type="spellStart"/>
+      <w:r>
+        <w:rPr>
+          <w:rFonts w:ascii="Palatino Linotype" w:hAnsi="Palatino Linotype"/>
+          <w:color w:val="000000" w:themeColor="text1"/>
+          <w:sz w:val="24"/>
+          <w:szCs w:val="24"/>
+        </w:rPr>
+        <w:t>add_password</w:t>
+      </w:r>
+      <w:proofErr w:type="spellEnd"/>
+      <w:r>
+        <w:rPr>
+          <w:rFonts w:ascii="Palatino Linotype" w:hAnsi="Palatino Linotype"/>
+          <w:color w:val="000000" w:themeColor="text1"/>
+          <w:sz w:val="24"/>
+          <w:szCs w:val="24"/>
+        </w:rPr>
+        <w:t xml:space="preserve">, </w:t>
+      </w:r>
+      <w:proofErr w:type="spellStart"/>
+      <w:r>
+        <w:rPr>
+          <w:rFonts w:ascii="Palatino Linotype" w:hAnsi="Palatino Linotype"/>
+          <w:color w:val="000000" w:themeColor="text1"/>
+          <w:sz w:val="24"/>
+          <w:szCs w:val="24"/>
+        </w:rPr>
+        <w:t>retrieve_password</w:t>
+      </w:r>
+      <w:proofErr w:type="spellEnd"/>
+      <w:r>
+        <w:rPr>
+          <w:rFonts w:ascii="Palatino Linotype" w:hAnsi="Palatino Linotype"/>
+          <w:color w:val="000000" w:themeColor="text1"/>
+          <w:sz w:val="24"/>
+          <w:szCs w:val="24"/>
+        </w:rPr>
+        <w:t>).</w:t>
       </w:r>
     </w:p>
     <w:p>
@@ -5309,6 +5284,7 @@
       <w:r>
         <w:rPr>
           <w:rFonts w:ascii="Palatino Linotype" w:hAnsi="Palatino Linotype"/>
+          <w:noProof/>
           <w:color w:val="000000" w:themeColor="text1"/>
           <w:sz w:val="24"/>
           <w:szCs w:val="24"/>
@@ -5435,6 +5411,7 @@
       <w:r>
         <w:rPr>
           <w:rFonts w:ascii="Palatino Linotype" w:hAnsi="Palatino Linotype"/>
+          <w:noProof/>
           <w:color w:val="000000" w:themeColor="text1"/>
           <w:sz w:val="24"/>
           <w:szCs w:val="24"/>
@@ -5526,6 +5503,7 @@
       <w:r>
         <w:rPr>
           <w:rFonts w:ascii="Palatino Linotype" w:hAnsi="Palatino Linotype"/>
+          <w:noProof/>
           <w:color w:val="000000" w:themeColor="text1"/>
           <w:sz w:val="24"/>
           <w:szCs w:val="24"/>
@@ -5671,12 +5649,11 @@
           <w:sz w:val="24"/>
           <w:szCs w:val="24"/>
         </w:rPr>
-        <w:lastRenderedPageBreak/>
         <w:drawing>
-          <wp:inline distT="0" distB="0" distL="0" distR="0" wp14:anchorId="6588DADC" wp14:editId="4E410F73">
-            <wp:extent cx="5344271" cy="1857634"/>
-            <wp:effectExtent l="0" t="0" r="8890" b="9525"/>
-            <wp:docPr id="1270856767" name="Picture 1"/>
+          <wp:inline distT="0" distB="0" distL="0" distR="0" wp14:anchorId="01D3289F" wp14:editId="233D5D37">
+            <wp:extent cx="5731510" cy="829310"/>
+            <wp:effectExtent l="0" t="0" r="2540" b="8890"/>
+            <wp:docPr id="443051043" name="Picture 1"/>
             <wp:cNvGraphicFramePr>
               <a:graphicFrameLocks xmlns:a="http://schemas.openxmlformats.org/drawingml/2006/main" noChangeAspect="1"/>
             </wp:cNvGraphicFramePr>
@@ -5684,7 +5661,7 @@
               <a:graphicData uri="http://schemas.openxmlformats.org/drawingml/2006/picture">
                 <pic:pic xmlns:pic="http://schemas.openxmlformats.org/drawingml/2006/picture">
                   <pic:nvPicPr>
-                    <pic:cNvPr id="1270856767" name=""/>
+                    <pic:cNvPr id="443051043" name=""/>
                     <pic:cNvPicPr/>
                   </pic:nvPicPr>
                   <pic:blipFill>
@@ -5696,7 +5673,7 @@
                   <pic:spPr>
                     <a:xfrm>
                       <a:off x="0" y="0"/>
-                      <a:ext cx="5344271" cy="1857634"/>
+                      <a:ext cx="5731510" cy="829310"/>
                     </a:xfrm>
                     <a:prstGeom prst="rect">
                       <a:avLst/>
@@ -5727,6 +5704,7 @@
           <w:sz w:val="24"/>
           <w:szCs w:val="24"/>
         </w:rPr>
+        <w:lastRenderedPageBreak/>
         <w:t>Explanation: The full challenge-response cycle completes successfully. The Vault issues a nonce, the Server computes the HMAC using the shared secret, and the Vault independently verifies it. Only then is the store operation permitted.</w:t>
       </w:r>
     </w:p>
@@ -5774,10 +5752,10 @@
           <w:szCs w:val="24"/>
         </w:rPr>
         <w:drawing>
-          <wp:inline distT="0" distB="0" distL="0" distR="0" wp14:anchorId="4481B286" wp14:editId="3EAA8D0E">
-            <wp:extent cx="5048955" cy="2057687"/>
-            <wp:effectExtent l="0" t="0" r="0" b="0"/>
-            <wp:docPr id="1032040874" name="Picture 1"/>
+          <wp:inline distT="0" distB="0" distL="0" distR="0" wp14:anchorId="38E76D6E" wp14:editId="215DED27">
+            <wp:extent cx="4944165" cy="2200582"/>
+            <wp:effectExtent l="0" t="0" r="8890" b="9525"/>
+            <wp:docPr id="924837711" name="Picture 1"/>
             <wp:cNvGraphicFramePr>
               <a:graphicFrameLocks xmlns:a="http://schemas.openxmlformats.org/drawingml/2006/main" noChangeAspect="1"/>
             </wp:cNvGraphicFramePr>
@@ -5785,7 +5763,7 @@
               <a:graphicData uri="http://schemas.openxmlformats.org/drawingml/2006/picture">
                 <pic:pic xmlns:pic="http://schemas.openxmlformats.org/drawingml/2006/picture">
                   <pic:nvPicPr>
-                    <pic:cNvPr id="1032040874" name=""/>
+                    <pic:cNvPr id="924837711" name=""/>
                     <pic:cNvPicPr/>
                   </pic:nvPicPr>
                   <pic:blipFill>
@@ -5797,7 +5775,7 @@
                   <pic:spPr>
                     <a:xfrm>
                       <a:off x="0" y="0"/>
-                      <a:ext cx="5048955" cy="2057687"/>
+                      <a:ext cx="4944165" cy="2200582"/>
                     </a:xfrm>
                     <a:prstGeom prst="rect">
                       <a:avLst/>
@@ -5828,7 +5806,27 @@
           <w:sz w:val="24"/>
           <w:szCs w:val="24"/>
         </w:rPr>
-        <w:t>Input: Server calls retrieve_password('user_001', 'github.com').</w:t>
+        <w:t xml:space="preserve">Input: Server calls </w:t>
+      </w:r>
+      <w:proofErr w:type="spellStart"/>
+      <w:r>
+        <w:rPr>
+          <w:rFonts w:ascii="Palatino Linotype" w:hAnsi="Palatino Linotype"/>
+          <w:color w:val="000000" w:themeColor="text1"/>
+          <w:sz w:val="24"/>
+          <w:szCs w:val="24"/>
+        </w:rPr>
+        <w:t>retrieve_password</w:t>
+      </w:r>
+      <w:proofErr w:type="spellEnd"/>
+      <w:r>
+        <w:rPr>
+          <w:rFonts w:ascii="Palatino Linotype" w:hAnsi="Palatino Linotype"/>
+          <w:color w:val="000000" w:themeColor="text1"/>
+          <w:sz w:val="24"/>
+          <w:szCs w:val="24"/>
+        </w:rPr>
+        <w:t>('user_001', 'github.com').</w:t>
       </w:r>
     </w:p>
     <w:p>
@@ -5888,19 +5886,30 @@
           <w:szCs w:val="24"/>
         </w:rPr>
       </w:pPr>
-      <w:r>
-        <w:rPr>
-          <w:rFonts w:ascii="Palatino Linotype" w:hAnsi="Palatino Linotype"/>
-          <w:color w:val="000000" w:themeColor="text1"/>
-          <w:sz w:val="24"/>
-          <w:szCs w:val="24"/>
-        </w:rPr>
-        <w:lastRenderedPageBreak/>
+    </w:p>
+    <w:p>
+      <w:pPr>
+        <w:spacing w:before="200" w:after="80"/>
+        <w:jc w:val="center"/>
+        <w:rPr>
+          <w:rFonts w:ascii="Palatino Linotype" w:hAnsi="Palatino Linotype"/>
+          <w:color w:val="000000" w:themeColor="text1"/>
+          <w:sz w:val="24"/>
+          <w:szCs w:val="24"/>
+        </w:rPr>
+      </w:pPr>
+      <w:r>
+        <w:rPr>
+          <w:rFonts w:ascii="Palatino Linotype" w:hAnsi="Palatino Linotype"/>
+          <w:color w:val="000000" w:themeColor="text1"/>
+          <w:sz w:val="24"/>
+          <w:szCs w:val="24"/>
+        </w:rPr>
         <w:drawing>
-          <wp:inline distT="0" distB="0" distL="0" distR="0" wp14:anchorId="6AA5F33A" wp14:editId="7B70EC22">
-            <wp:extent cx="4439270" cy="2362530"/>
+          <wp:inline distT="0" distB="0" distL="0" distR="0" wp14:anchorId="25EA87ED" wp14:editId="316D45DF">
+            <wp:extent cx="4229690" cy="2267266"/>
             <wp:effectExtent l="0" t="0" r="0" b="0"/>
-            <wp:docPr id="538161963" name="Picture 1"/>
+            <wp:docPr id="741341784" name="Picture 1"/>
             <wp:cNvGraphicFramePr>
               <a:graphicFrameLocks xmlns:a="http://schemas.openxmlformats.org/drawingml/2006/main" noChangeAspect="1"/>
             </wp:cNvGraphicFramePr>
@@ -5908,7 +5917,7 @@
               <a:graphicData uri="http://schemas.openxmlformats.org/drawingml/2006/picture">
                 <pic:pic xmlns:pic="http://schemas.openxmlformats.org/drawingml/2006/picture">
                   <pic:nvPicPr>
-                    <pic:cNvPr id="538161963" name=""/>
+                    <pic:cNvPr id="741341784" name=""/>
                     <pic:cNvPicPr/>
                   </pic:nvPicPr>
                   <pic:blipFill>
@@ -5920,7 +5929,7 @@
                   <pic:spPr>
                     <a:xfrm>
                       <a:off x="0" y="0"/>
-                      <a:ext cx="4439270" cy="2362530"/>
+                      <a:ext cx="4229690" cy="2267266"/>
                     </a:xfrm>
                     <a:prstGeom prst="rect">
                       <a:avLst/>
@@ -5984,7 +5993,37 @@
           <w:sz w:val="24"/>
           <w:szCs w:val="24"/>
         </w:rPr>
-        <w:t>Explanation: The stale nonce is not present in the Vault's active_nonces store (it was either never issued or has already been consumed), so the request is immediately rejected at Step 5(a). The old timestamp would also have triggered a rejection at Step 5(c).</w:t>
+        <w:t xml:space="preserve">Explanation: The stale nonce is not present in the Vault's </w:t>
+      </w:r>
+      <w:proofErr w:type="spellStart"/>
+      <w:r>
+        <w:rPr>
+          <w:rFonts w:ascii="Palatino Linotype" w:hAnsi="Palatino Linotype"/>
+          <w:color w:val="000000" w:themeColor="text1"/>
+          <w:sz w:val="24"/>
+          <w:szCs w:val="24"/>
+        </w:rPr>
+        <w:t>active_nonces</w:t>
+      </w:r>
+      <w:proofErr w:type="spellEnd"/>
+      <w:r>
+        <w:rPr>
+          <w:rFonts w:ascii="Palatino Linotype" w:hAnsi="Palatino Linotype"/>
+          <w:color w:val="000000" w:themeColor="text1"/>
+          <w:sz w:val="24"/>
+          <w:szCs w:val="24"/>
+        </w:rPr>
+        <w:t xml:space="preserve"> store (it was either never issued or has already been consumed), so the request is immediately </w:t>
+      </w:r>
+      <w:r>
+        <w:rPr>
+          <w:rFonts w:ascii="Palatino Linotype" w:hAnsi="Palatino Linotype"/>
+          <w:color w:val="000000" w:themeColor="text1"/>
+          <w:sz w:val="24"/>
+          <w:szCs w:val="24"/>
+        </w:rPr>
+        <w:lastRenderedPageBreak/>
+        <w:t>rejected at Step 5(a). The old timestamp would also have triggered a rejection at Step 5(c).</w:t>
       </w:r>
     </w:p>
     <w:p>
@@ -6033,91 +6072,73 @@
     </w:p>
     <w:p>
       <w:pPr>
-        <w:shd w:val="clear" w:color="auto" w:fill="F4F4F4"/>
-        <w:jc w:val="center"/>
-        <w:rPr>
-          <w:rFonts w:ascii="Palatino Linotype" w:hAnsi="Palatino Linotype"/>
-          <w:color w:val="000000" w:themeColor="text1"/>
-          <w:sz w:val="24"/>
-          <w:szCs w:val="24"/>
-        </w:rPr>
-      </w:pPr>
-      <w:r>
-        <w:rPr>
-          <w:rFonts w:ascii="Palatino Linotype" w:eastAsia="Courier New" w:hAnsi="Palatino Linotype" w:cs="Courier New"/>
-          <w:color w:val="000000" w:themeColor="text1"/>
-          <w:sz w:val="24"/>
-          <w:szCs w:val="24"/>
-        </w:rPr>
-        <w:t>[ATTACKER] Attempting to forge an HMAC with wrong key...</w:t>
-      </w:r>
-    </w:p>
-    <w:p>
-      <w:pPr>
-        <w:shd w:val="clear" w:color="auto" w:fill="F4F4F4"/>
-        <w:jc w:val="center"/>
-        <w:rPr>
-          <w:rFonts w:ascii="Palatino Linotype" w:hAnsi="Palatino Linotype"/>
-          <w:color w:val="000000" w:themeColor="text1"/>
-          <w:sz w:val="24"/>
-          <w:szCs w:val="24"/>
-        </w:rPr>
-      </w:pPr>
-      <w:r>
-        <w:rPr>
-          <w:rFonts w:ascii="Palatino Linotype" w:eastAsia="Courier New" w:hAnsi="Palatino Linotype" w:cs="Courier New"/>
-          <w:color w:val="000000" w:themeColor="text1"/>
-          <w:sz w:val="24"/>
-          <w:szCs w:val="24"/>
-        </w:rPr>
-        <w:t>[VAULT]    Challenge issued -&gt; nonce=40ce90f0631dbe31... (valid, live nonce)</w:t>
-      </w:r>
-    </w:p>
-    <w:p>
-      <w:pPr>
-        <w:shd w:val="clear" w:color="auto" w:fill="F4F4F4"/>
-        <w:jc w:val="center"/>
-        <w:rPr>
-          <w:rFonts w:ascii="Palatino Linotype" w:hAnsi="Palatino Linotype"/>
-          <w:color w:val="000000" w:themeColor="text1"/>
-          <w:sz w:val="24"/>
-          <w:szCs w:val="24"/>
-        </w:rPr>
-      </w:pPr>
-      <w:r>
-        <w:rPr>
-          <w:rFonts w:ascii="Palatino Linotype" w:eastAsia="Courier New" w:hAnsi="Palatino Linotype" w:cs="Courier New"/>
-          <w:color w:val="000000" w:themeColor="text1"/>
-          <w:sz w:val="24"/>
-          <w:szCs w:val="24"/>
-        </w:rPr>
-        <w:t>[VAULT]    Auth DENIED -- HMAC mismatch (impersonation attempt blocked)</w:t>
-      </w:r>
-    </w:p>
-    <w:p>
-      <w:pPr>
-        <w:shd w:val="clear" w:color="auto" w:fill="F4F4F4"/>
-        <w:jc w:val="center"/>
-        <w:rPr>
-          <w:rFonts w:ascii="Palatino Linotype" w:hAnsi="Palatino Linotype"/>
-          <w:color w:val="000000" w:themeColor="text1"/>
-          <w:sz w:val="24"/>
-          <w:szCs w:val="24"/>
-        </w:rPr>
-      </w:pPr>
-      <w:r>
-        <w:rPr>
-          <w:rFonts w:ascii="Palatino Linotype" w:eastAsia="Courier New" w:hAnsi="Palatino Linotype" w:cs="Courier New"/>
-          <w:color w:val="000000" w:themeColor="text1"/>
-          <w:sz w:val="24"/>
-          <w:szCs w:val="24"/>
-        </w:rPr>
-        <w:t>[ATTACKER] Result: {'status': 'denied', 'reason': 'hmac_mismatch'}</w:t>
-      </w:r>
-    </w:p>
-    <w:p>
-      <w:pPr>
         <w:spacing w:before="80" w:after="120"/>
+        <w:rPr>
+          <w:rFonts w:ascii="Palatino Linotype" w:hAnsi="Palatino Linotype"/>
+          <w:color w:val="000000" w:themeColor="text1"/>
+          <w:sz w:val="24"/>
+          <w:szCs w:val="24"/>
+        </w:rPr>
+      </w:pPr>
+    </w:p>
+    <w:p>
+      <w:pPr>
+        <w:spacing w:before="80" w:after="120"/>
+        <w:jc w:val="center"/>
+        <w:rPr>
+          <w:rFonts w:ascii="Palatino Linotype" w:hAnsi="Palatino Linotype"/>
+          <w:color w:val="000000" w:themeColor="text1"/>
+          <w:sz w:val="24"/>
+          <w:szCs w:val="24"/>
+        </w:rPr>
+      </w:pPr>
+      <w:r>
+        <w:rPr>
+          <w:rFonts w:ascii="Palatino Linotype" w:hAnsi="Palatino Linotype"/>
+          <w:color w:val="000000" w:themeColor="text1"/>
+          <w:sz w:val="24"/>
+          <w:szCs w:val="24"/>
+        </w:rPr>
+        <w:drawing>
+          <wp:inline distT="0" distB="0" distL="0" distR="0" wp14:anchorId="2CA70907" wp14:editId="1F122B16">
+            <wp:extent cx="4867954" cy="1390844"/>
+            <wp:effectExtent l="0" t="0" r="8890" b="0"/>
+            <wp:docPr id="1352513881" name="Picture 1"/>
+            <wp:cNvGraphicFramePr>
+              <a:graphicFrameLocks xmlns:a="http://schemas.openxmlformats.org/drawingml/2006/main" noChangeAspect="1"/>
+            </wp:cNvGraphicFramePr>
+            <a:graphic xmlns:a="http://schemas.openxmlformats.org/drawingml/2006/main">
+              <a:graphicData uri="http://schemas.openxmlformats.org/drawingml/2006/picture">
+                <pic:pic xmlns:pic="http://schemas.openxmlformats.org/drawingml/2006/picture">
+                  <pic:nvPicPr>
+                    <pic:cNvPr id="1352513881" name=""/>
+                    <pic:cNvPicPr/>
+                  </pic:nvPicPr>
+                  <pic:blipFill>
+                    <a:blip r:embed="rId12"/>
+                    <a:stretch>
+                      <a:fillRect/>
+                    </a:stretch>
+                  </pic:blipFill>
+                  <pic:spPr>
+                    <a:xfrm>
+                      <a:off x="0" y="0"/>
+                      <a:ext cx="4867954" cy="1390844"/>
+                    </a:xfrm>
+                    <a:prstGeom prst="rect">
+                      <a:avLst/>
+                    </a:prstGeom>
+                  </pic:spPr>
+                </pic:pic>
+              </a:graphicData>
+            </a:graphic>
+          </wp:inline>
+        </w:drawing>
+      </w:r>
+    </w:p>
+    <w:p>
+      <w:pPr>
+        <w:spacing w:before="80" w:after="120"/>
         <w:jc w:val="center"/>
         <w:rPr>
           <w:rFonts w:ascii="Palatino Linotype" w:hAnsi="Palatino Linotype"/>
@@ -6140,14 +6161,6 @@
       <w:pPr>
         <w:spacing w:before="200" w:after="80"/>
         <w:jc w:val="center"/>
-        <w:rPr>
-          <w:rFonts w:ascii="Palatino Linotype" w:hAnsi="Palatino Linotype"/>
-          <w:color w:val="000000" w:themeColor="text1"/>
-          <w:sz w:val="24"/>
-          <w:szCs w:val="24"/>
-        </w:rPr>
-      </w:pPr>
-      <w:r>
         <w:rPr>
           <w:rFonts w:ascii="Palatino Linotype" w:hAnsi="Palatino Linotype"/>
           <w:b/>
@@ -6156,11 +6169,76 @@
           <w:sz w:val="24"/>
           <w:szCs w:val="24"/>
         </w:rPr>
+      </w:pPr>
+      <w:r>
+        <w:rPr>
+          <w:rFonts w:ascii="Palatino Linotype" w:hAnsi="Palatino Linotype"/>
+          <w:b/>
+          <w:bCs/>
+          <w:color w:val="000000" w:themeColor="text1"/>
+          <w:sz w:val="24"/>
+          <w:szCs w:val="24"/>
+        </w:rPr>
         <w:t>Audit Log Output</w:t>
       </w:r>
     </w:p>
     <w:p>
       <w:pPr>
+        <w:spacing w:before="200" w:after="80"/>
+        <w:jc w:val="center"/>
+        <w:rPr>
+          <w:rFonts w:ascii="Palatino Linotype" w:hAnsi="Palatino Linotype"/>
+          <w:color w:val="000000" w:themeColor="text1"/>
+          <w:sz w:val="24"/>
+          <w:szCs w:val="24"/>
+        </w:rPr>
+      </w:pPr>
+      <w:r>
+        <w:rPr>
+          <w:rFonts w:ascii="Palatino Linotype" w:hAnsi="Palatino Linotype"/>
+          <w:color w:val="000000" w:themeColor="text1"/>
+          <w:sz w:val="24"/>
+          <w:szCs w:val="24"/>
+        </w:rPr>
+        <w:drawing>
+          <wp:inline distT="0" distB="0" distL="0" distR="0" wp14:anchorId="4D0A967D" wp14:editId="59220383">
+            <wp:extent cx="5731510" cy="1287780"/>
+            <wp:effectExtent l="0" t="0" r="2540" b="7620"/>
+            <wp:docPr id="129397104" name="Picture 1"/>
+            <wp:cNvGraphicFramePr>
+              <a:graphicFrameLocks xmlns:a="http://schemas.openxmlformats.org/drawingml/2006/main" noChangeAspect="1"/>
+            </wp:cNvGraphicFramePr>
+            <a:graphic xmlns:a="http://schemas.openxmlformats.org/drawingml/2006/main">
+              <a:graphicData uri="http://schemas.openxmlformats.org/drawingml/2006/picture">
+                <pic:pic xmlns:pic="http://schemas.openxmlformats.org/drawingml/2006/picture">
+                  <pic:nvPicPr>
+                    <pic:cNvPr id="129397104" name=""/>
+                    <pic:cNvPicPr/>
+                  </pic:nvPicPr>
+                  <pic:blipFill>
+                    <a:blip r:embed="rId13"/>
+                    <a:stretch>
+                      <a:fillRect/>
+                    </a:stretch>
+                  </pic:blipFill>
+                  <pic:spPr>
+                    <a:xfrm>
+                      <a:off x="0" y="0"/>
+                      <a:ext cx="5731510" cy="1287780"/>
+                    </a:xfrm>
+                    <a:prstGeom prst="rect">
+                      <a:avLst/>
+                    </a:prstGeom>
+                  </pic:spPr>
+                </pic:pic>
+              </a:graphicData>
+            </a:graphic>
+          </wp:inline>
+        </w:drawing>
+      </w:r>
+    </w:p>
+    <w:p>
+      <w:pPr>
         <w:spacing w:before="80" w:after="120"/>
         <w:jc w:val="center"/>
         <w:rPr>
@@ -6182,196 +6260,6 @@
     </w:p>
     <w:p>
       <w:pPr>
-        <w:shd w:val="clear" w:color="auto" w:fill="F4F4F4"/>
-        <w:jc w:val="center"/>
-        <w:rPr>
-          <w:rFonts w:ascii="Palatino Linotype" w:hAnsi="Palatino Linotype"/>
-          <w:color w:val="000000" w:themeColor="text1"/>
-          <w:sz w:val="24"/>
-          <w:szCs w:val="24"/>
-        </w:rPr>
-      </w:pPr>
-      <w:r>
-        <w:rPr>
-          <w:rFonts w:ascii="Palatino Linotype" w:eastAsia="Courier New" w:hAnsi="Palatino Linotype" w:cs="Courier New"/>
-          <w:color w:val="000000" w:themeColor="text1"/>
-          <w:sz w:val="24"/>
-          <w:szCs w:val="24"/>
-        </w:rPr>
-        <w:t>[VAULT] -- Audit Log --</w:t>
-      </w:r>
-    </w:p>
-    <w:p>
-      <w:pPr>
-        <w:shd w:val="clear" w:color="auto" w:fill="F4F4F4"/>
-        <w:jc w:val="center"/>
-        <w:rPr>
-          <w:rFonts w:ascii="Palatino Linotype" w:hAnsi="Palatino Linotype"/>
-          <w:color w:val="000000" w:themeColor="text1"/>
-          <w:sz w:val="24"/>
-          <w:szCs w:val="24"/>
-        </w:rPr>
-      </w:pPr>
-      <w:r>
-        <w:rPr>
-          <w:rFonts w:ascii="Palatino Linotype" w:eastAsia="Courier New" w:hAnsi="Palatino Linotype" w:cs="Courier New"/>
-          <w:color w:val="000000" w:themeColor="text1"/>
-          <w:sz w:val="24"/>
-          <w:szCs w:val="24"/>
-        </w:rPr>
-        <w:t>[2026-04-21T13:22:33] CHALLENGE_ISSUED  | {nonce: 'f73acac3...' }</w:t>
-      </w:r>
-    </w:p>
-    <w:p>
-      <w:pPr>
-        <w:shd w:val="clear" w:color="auto" w:fill="F4F4F4"/>
-        <w:jc w:val="center"/>
-        <w:rPr>
-          <w:rFonts w:ascii="Palatino Linotype" w:hAnsi="Palatino Linotype"/>
-          <w:color w:val="000000" w:themeColor="text1"/>
-          <w:sz w:val="24"/>
-          <w:szCs w:val="24"/>
-        </w:rPr>
-      </w:pPr>
-      <w:r>
-        <w:rPr>
-          <w:rFonts w:ascii="Palatino Linotype" w:eastAsia="Courier New" w:hAnsi="Palatino Linotype" w:cs="Courier New"/>
-          <w:color w:val="000000" w:themeColor="text1"/>
-          <w:sz w:val="24"/>
-          <w:szCs w:val="24"/>
-        </w:rPr>
-        <w:t>[2026-04-21T13:22:33] AUTH_GRANTED      | {request_type: 'STORE_RECORD'}</w:t>
-      </w:r>
-    </w:p>
-    <w:p>
-      <w:pPr>
-        <w:shd w:val="clear" w:color="auto" w:fill="F4F4F4"/>
-        <w:jc w:val="center"/>
-        <w:rPr>
-          <w:rFonts w:ascii="Palatino Linotype" w:hAnsi="Palatino Linotype"/>
-          <w:color w:val="000000" w:themeColor="text1"/>
-          <w:sz w:val="24"/>
-          <w:szCs w:val="24"/>
-        </w:rPr>
-      </w:pPr>
-      <w:r>
-        <w:rPr>
-          <w:rFonts w:ascii="Palatino Linotype" w:eastAsia="Courier New" w:hAnsi="Palatino Linotype" w:cs="Courier New"/>
-          <w:color w:val="000000" w:themeColor="text1"/>
-          <w:sz w:val="24"/>
-          <w:szCs w:val="24"/>
-        </w:rPr>
-        <w:t>[2026-04-21T13:22:33] RECORD_STORED     | {user_id: 'user_001', site: 'twitter.com'}</w:t>
-      </w:r>
-    </w:p>
-    <w:p>
-      <w:pPr>
-        <w:shd w:val="clear" w:color="auto" w:fill="F4F4F4"/>
-        <w:jc w:val="center"/>
-        <w:rPr>
-          <w:rFonts w:ascii="Palatino Linotype" w:hAnsi="Palatino Linotype"/>
-          <w:color w:val="000000" w:themeColor="text1"/>
-          <w:sz w:val="24"/>
-          <w:szCs w:val="24"/>
-        </w:rPr>
-      </w:pPr>
-      <w:r>
-        <w:rPr>
-          <w:rFonts w:ascii="Palatino Linotype" w:eastAsia="Courier New" w:hAnsi="Palatino Linotype" w:cs="Courier New"/>
-          <w:color w:val="000000" w:themeColor="text1"/>
-          <w:sz w:val="24"/>
-          <w:szCs w:val="24"/>
-        </w:rPr>
-        <w:t>[2026-04-21T13:22:33] CHALLENGE_ISSUED  | {nonce: 'dc14e88a...'}</w:t>
-      </w:r>
-    </w:p>
-    <w:p>
-      <w:pPr>
-        <w:shd w:val="clear" w:color="auto" w:fill="F4F4F4"/>
-        <w:jc w:val="center"/>
-        <w:rPr>
-          <w:rFonts w:ascii="Palatino Linotype" w:hAnsi="Palatino Linotype"/>
-          <w:color w:val="000000" w:themeColor="text1"/>
-          <w:sz w:val="24"/>
-          <w:szCs w:val="24"/>
-        </w:rPr>
-      </w:pPr>
-      <w:r>
-        <w:rPr>
-          <w:rFonts w:ascii="Palatino Linotype" w:eastAsia="Courier New" w:hAnsi="Palatino Linotype" w:cs="Courier New"/>
-          <w:color w:val="000000" w:themeColor="text1"/>
-          <w:sz w:val="24"/>
-          <w:szCs w:val="24"/>
-        </w:rPr>
-        <w:t>[2026-04-21T13:22:33] AUTH_GRANTED      | {request_type: 'RETRIEVE_RECORD'}</w:t>
-      </w:r>
-    </w:p>
-    <w:p>
-      <w:pPr>
-        <w:shd w:val="clear" w:color="auto" w:fill="F4F4F4"/>
-        <w:jc w:val="center"/>
-        <w:rPr>
-          <w:rFonts w:ascii="Palatino Linotype" w:hAnsi="Palatino Linotype"/>
-          <w:color w:val="000000" w:themeColor="text1"/>
-          <w:sz w:val="24"/>
-          <w:szCs w:val="24"/>
-        </w:rPr>
-      </w:pPr>
-      <w:r>
-        <w:rPr>
-          <w:rFonts w:ascii="Palatino Linotype" w:eastAsia="Courier New" w:hAnsi="Palatino Linotype" w:cs="Courier New"/>
-          <w:color w:val="000000" w:themeColor="text1"/>
-          <w:sz w:val="24"/>
-          <w:szCs w:val="24"/>
-        </w:rPr>
-        <w:lastRenderedPageBreak/>
-        <w:t>[2026-04-21T13:22:33] AUTH_DENIED       | {reason: 'Unknown nonce'}</w:t>
-      </w:r>
-    </w:p>
-    <w:p>
-      <w:pPr>
-        <w:shd w:val="clear" w:color="auto" w:fill="F4F4F4"/>
-        <w:jc w:val="center"/>
-        <w:rPr>
-          <w:rFonts w:ascii="Palatino Linotype" w:hAnsi="Palatino Linotype"/>
-          <w:color w:val="000000" w:themeColor="text1"/>
-          <w:sz w:val="24"/>
-          <w:szCs w:val="24"/>
-        </w:rPr>
-      </w:pPr>
-      <w:r>
-        <w:rPr>
-          <w:rFonts w:ascii="Palatino Linotype" w:eastAsia="Courier New" w:hAnsi="Palatino Linotype" w:cs="Courier New"/>
-          <w:color w:val="000000" w:themeColor="text1"/>
-          <w:sz w:val="24"/>
-          <w:szCs w:val="24"/>
-        </w:rPr>
-        <w:t>[2026-04-21T13:22:33] CHALLENGE_ISSUED  | {nonce: '40ce90f0...'}</w:t>
-      </w:r>
-    </w:p>
-    <w:p>
-      <w:pPr>
-        <w:shd w:val="clear" w:color="auto" w:fill="F4F4F4"/>
-        <w:jc w:val="center"/>
-        <w:rPr>
-          <w:rFonts w:ascii="Palatino Linotype" w:hAnsi="Palatino Linotype"/>
-          <w:color w:val="000000" w:themeColor="text1"/>
-          <w:sz w:val="24"/>
-          <w:szCs w:val="24"/>
-        </w:rPr>
-      </w:pPr>
-      <w:r>
-        <w:rPr>
-          <w:rFonts w:ascii="Palatino Linotype" w:eastAsia="Courier New" w:hAnsi="Palatino Linotype" w:cs="Courier New"/>
-          <w:color w:val="000000" w:themeColor="text1"/>
-          <w:sz w:val="24"/>
-          <w:szCs w:val="24"/>
-        </w:rPr>
-        <w:t>[2026-04-21T13:22:33] AUTH_DENIED       | {reason: 'HMAC mismatch'}</w:t>
-      </w:r>
-    </w:p>
-    <w:p>
-      <w:pPr>
         <w:pStyle w:val="Heading2"/>
         <w:jc w:val="center"/>
         <w:rPr>
@@ -6405,7 +6293,87 @@
           <w:sz w:val="24"/>
           <w:szCs w:val="24"/>
         </w:rPr>
-        <w:t>The implementation directly realises the six-step protocol described in Section 2.2.3. Steps 1 and 2 correspond to issue_challenge(); Steps 3 and 4 to _authenticate() in PasswordServer; and Steps 5 and 6 to verify_and_grant() in PasswordVault. All security properties described in the analysis — replay resistance, impersonation prevention, constant-time comparison, one-time nonce consumption, and audit logging — are present in the code and evidenced in the output above.</w:t>
+        <w:t xml:space="preserve">The implementation directly realises the six-step protocol described in Section 2.2.3. Steps 1 and 2 correspond to </w:t>
+      </w:r>
+      <w:proofErr w:type="spellStart"/>
+      <w:r>
+        <w:rPr>
+          <w:rFonts w:ascii="Palatino Linotype" w:hAnsi="Palatino Linotype"/>
+          <w:color w:val="000000" w:themeColor="text1"/>
+          <w:sz w:val="24"/>
+          <w:szCs w:val="24"/>
+        </w:rPr>
+        <w:t>issue_challenge</w:t>
+      </w:r>
+      <w:proofErr w:type="spellEnd"/>
+      <w:r>
+        <w:rPr>
+          <w:rFonts w:ascii="Palatino Linotype" w:hAnsi="Palatino Linotype"/>
+          <w:color w:val="000000" w:themeColor="text1"/>
+          <w:sz w:val="24"/>
+          <w:szCs w:val="24"/>
+        </w:rPr>
+        <w:t xml:space="preserve">(); Steps 3 and 4 to _authenticate() in </w:t>
+      </w:r>
+      <w:proofErr w:type="spellStart"/>
+      <w:r>
+        <w:rPr>
+          <w:rFonts w:ascii="Palatino Linotype" w:hAnsi="Palatino Linotype"/>
+          <w:color w:val="000000" w:themeColor="text1"/>
+          <w:sz w:val="24"/>
+          <w:szCs w:val="24"/>
+        </w:rPr>
+        <w:t>PasswordServer</w:t>
+      </w:r>
+      <w:proofErr w:type="spellEnd"/>
+      <w:r>
+        <w:rPr>
+          <w:rFonts w:ascii="Palatino Linotype" w:hAnsi="Palatino Linotype"/>
+          <w:color w:val="000000" w:themeColor="text1"/>
+          <w:sz w:val="24"/>
+          <w:szCs w:val="24"/>
+        </w:rPr>
+        <w:t xml:space="preserve">; and Steps 5 and 6 to </w:t>
+      </w:r>
+      <w:proofErr w:type="spellStart"/>
+      <w:r>
+        <w:rPr>
+          <w:rFonts w:ascii="Palatino Linotype" w:hAnsi="Palatino Linotype"/>
+          <w:color w:val="000000" w:themeColor="text1"/>
+          <w:sz w:val="24"/>
+          <w:szCs w:val="24"/>
+        </w:rPr>
+        <w:t>verify_and_grant</w:t>
+      </w:r>
+      <w:proofErr w:type="spellEnd"/>
+      <w:r>
+        <w:rPr>
+          <w:rFonts w:ascii="Palatino Linotype" w:hAnsi="Palatino Linotype"/>
+          <w:color w:val="000000" w:themeColor="text1"/>
+          <w:sz w:val="24"/>
+          <w:szCs w:val="24"/>
+        </w:rPr>
+        <w:t xml:space="preserve">() in </w:t>
+      </w:r>
+      <w:proofErr w:type="spellStart"/>
+      <w:r>
+        <w:rPr>
+          <w:rFonts w:ascii="Palatino Linotype" w:hAnsi="Palatino Linotype"/>
+          <w:color w:val="000000" w:themeColor="text1"/>
+          <w:sz w:val="24"/>
+          <w:szCs w:val="24"/>
+        </w:rPr>
+        <w:t>PasswordVault</w:t>
+      </w:r>
+      <w:proofErr w:type="spellEnd"/>
+      <w:r>
+        <w:rPr>
+          <w:rFonts w:ascii="Palatino Linotype" w:hAnsi="Palatino Linotype"/>
+          <w:color w:val="000000" w:themeColor="text1"/>
+          <w:sz w:val="24"/>
+          <w:szCs w:val="24"/>
+        </w:rPr>
+        <w:t>. All security properties described in the analysis — replay resistance, impersonation prevention, constant-time comparison, one-time nonce consumption, and audit logging — are present in the code and evidenced in the output above.</w:t>
       </w:r>
     </w:p>
     <w:p>
@@ -6657,7 +6625,27 @@
           <w:sz w:val="24"/>
           <w:szCs w:val="24"/>
         </w:rPr>
-        <w:t>Taylor, D., Wu, T., Mavrogiannopoulos, N. and Perrin, T. (2007) Using the Secure Remote Password (SRP) Protocol for TLS Authentication. RFC 5054. IETF. Available at: https://www.rfc-editor.org/rfc/rfc5054</w:t>
+        <w:t xml:space="preserve">Taylor, D., Wu, T., </w:t>
+      </w:r>
+      <w:proofErr w:type="spellStart"/>
+      <w:r>
+        <w:rPr>
+          <w:rFonts w:ascii="Palatino Linotype" w:hAnsi="Palatino Linotype"/>
+          <w:color w:val="000000" w:themeColor="text1"/>
+          <w:sz w:val="24"/>
+          <w:szCs w:val="24"/>
+        </w:rPr>
+        <w:t>Mavrogiannopoulos</w:t>
+      </w:r>
+      <w:proofErr w:type="spellEnd"/>
+      <w:r>
+        <w:rPr>
+          <w:rFonts w:ascii="Palatino Linotype" w:hAnsi="Palatino Linotype"/>
+          <w:color w:val="000000" w:themeColor="text1"/>
+          <w:sz w:val="24"/>
+          <w:szCs w:val="24"/>
+        </w:rPr>
+        <w:t>, N. and Perrin, T. (2007) Using the Secure Remote Password (SRP) Protocol for TLS Authentication. RFC 5054. IETF. Available at: https://www.rfc-editor.org/rfc/rfc5054</w:t>
       </w:r>
     </w:p>
     <w:p>
@@ -6720,7 +6708,27 @@
           <w:sz w:val="24"/>
           <w:szCs w:val="24"/>
         </w:rPr>
-        <w:t>Biryukov, A., Dinu, D. and Khovratovich, D. (2016) Argon2: New Generation of Memory-Hard Functions for Password Hashing and Other Applications. 2016 IEEE European Symposium on Security and Privacy. IEEE.</w:t>
+        <w:t xml:space="preserve">Biryukov, A., Dinu, D. and </w:t>
+      </w:r>
+      <w:proofErr w:type="spellStart"/>
+      <w:r>
+        <w:rPr>
+          <w:rFonts w:ascii="Palatino Linotype" w:hAnsi="Palatino Linotype"/>
+          <w:color w:val="000000" w:themeColor="text1"/>
+          <w:sz w:val="24"/>
+          <w:szCs w:val="24"/>
+        </w:rPr>
+        <w:t>Khovratovich</w:t>
+      </w:r>
+      <w:proofErr w:type="spellEnd"/>
+      <w:r>
+        <w:rPr>
+          <w:rFonts w:ascii="Palatino Linotype" w:hAnsi="Palatino Linotype"/>
+          <w:color w:val="000000" w:themeColor="text1"/>
+          <w:sz w:val="24"/>
+          <w:szCs w:val="24"/>
+        </w:rPr>
+        <w:t>, D. (2016) Argon2: New Generation of Memory-Hard Functions for Password Hashing and Other Applications. 2016 IEEE European Symposium on Security and Privacy. IEEE.</w:t>
       </w:r>
     </w:p>
     <w:p>
@@ -7015,12 +7023,8 @@
     </w:p>
     <w:p>
       <w:pPr>
-        <w:numPr>
-          <w:ilvl w:val="0"/>
-          <w:numId w:val="5"/>
-        </w:numPr>
         <w:spacing w:before="80" w:after="80"/>
-        <w:jc w:val="center"/>
+        <w:ind w:left="720"/>
         <w:rPr>
           <w:rFonts w:ascii="Palatino Linotype" w:hAnsi="Palatino Linotype"/>
           <w:color w:val="000000" w:themeColor="text1"/>

</xml_diff>